<commit_message>
Version 1.1.0 : bulletins Word/PDF, taux de taxe par période, statut des enseignants
- Modèles de bulletin : modèle Word et PDF standard, import de modèles
  (à balises ou bulletin déjà rempli), activation, aperçu ; export PDF.
- Taux de taxe paramétrable par l'administrateur, propre à chaque période
  et figé à la validation (trigger SQL) ; migration des bases existantes.
- Changement de statut d'un enseignant (vacataire / permanent), journalisé.
- Désactiver / réactiver un enseignant exige la permission de modification
  (un compte en consultation ne le peut plus).
- Les sauvegardes emportent les modèles de bulletin importés et la
  restauration les remet en place.
- La réinitialisation des données conserve le journal d'audit en entier.
- En-tête et logo réels de l'établissement hors du dépôt :
  config/etablissement_local.py (voir l'exemple) et
  build_template.py --etablissement ; modèles neutres dans templates/.
</commit_message>
<xml_diff>
--- a/templates/bulletin_template.docx
+++ b/templates/bulletin_template.docx
@@ -4,234 +4,330 @@
   <w:body>
     <w:tbl>
       <w:tblPr>
-        <w:tblW w:type="auto" w:w="0"/>
+        <w:tblW w:type="dxa" w:w="10566"/>
         <w:jc w:val="center"/>
         <w:tblLook w:firstColumn="1" w:firstRow="1" w:lastColumn="0" w:lastRow="0" w:noHBand="0" w:noVBand="1" w:val="04A0"/>
+        <w:tblBorders>
+          <w:top w:val="single" w:sz="12" w:space="0" w:color="000000"/>
+          <w:left w:val="single" w:sz="12" w:space="0" w:color="000000"/>
+          <w:bottom w:val="single" w:sz="12" w:space="0" w:color="000000"/>
+          <w:right w:val="single" w:sz="12" w:space="0" w:color="000000"/>
+          <w:insideH w:val="nil"/>
+          <w:insideV w:val="nil"/>
+        </w:tblBorders>
+        <w:tblLayout w:type="fixed"/>
+        <w:tblCellMar>
+          <w:top w:w="0" w:type="dxa"/>
+          <w:bottom w:w="0" w:type="dxa"/>
+          <w:left w:w="20" w:type="dxa"/>
+          <w:right w:w="20" w:type="dxa"/>
+        </w:tblCellMar>
       </w:tblPr>
       <w:tblGrid>
-        <w:gridCol w:w="4252"/>
-        <w:gridCol w:w="1701"/>
-        <w:gridCol w:w="4252"/>
+        <w:gridCol w:w="942"/>
+        <w:gridCol w:w="898"/>
+        <w:gridCol w:w="3718"/>
+        <w:gridCol w:w="1044"/>
+        <w:gridCol w:w="1042"/>
+        <w:gridCol w:w="1046"/>
+        <w:gridCol w:w="1876"/>
       </w:tblGrid>
       <w:tr>
+        <w:trPr>
+          <w:trHeight w:val="1604" w:hRule="exact"/>
+        </w:trPr>
         <w:tc>
           <w:tcPr>
-            <w:tcW w:type="dxa" w:w="3402"/>
+            <w:tcW w:type="dxa" w:w="10566"/>
+            <w:gridSpan w:val="7"/>
+            <w:tcBorders>
+              <w:bottom w:val="single" w:sz="12" w:space="0" w:color="000000"/>
+            </w:tcBorders>
           </w:tcPr>
           <w:p>
             <w:pPr>
+              <w:spacing w:before="0" w:after="0" w:line="20" w:lineRule="exact"/>
+              <w:jc w:val="center"/>
+            </w:pPr>
+            <w:r/>
+          </w:p>
+          <w:tbl>
+            <w:tblPr>
+              <w:tblW w:type="dxa" w:w="10566"/>
+              <w:tblLook w:firstColumn="1" w:firstRow="1" w:lastColumn="0" w:lastRow="0" w:noHBand="0" w:noVBand="1" w:val="04A0"/>
+              <w:tblBorders>
+                <w:top w:val="nil"/>
+                <w:left w:val="nil"/>
+                <w:bottom w:val="nil"/>
+                <w:right w:val="nil"/>
+                <w:insideH w:val="nil"/>
+                <w:insideV w:val="nil"/>
+              </w:tblBorders>
+              <w:tblLayout w:type="fixed"/>
+              <w:tblCellMar>
+                <w:top w:w="0" w:type="dxa"/>
+                <w:bottom w:w="0" w:type="dxa"/>
+                <w:left w:w="20" w:type="dxa"/>
+                <w:right w:w="20" w:type="dxa"/>
+              </w:tblCellMar>
+            </w:tblPr>
+            <w:tblGrid>
+              <w:gridCol w:w="4242"/>
+              <w:gridCol w:w="2200"/>
+              <w:gridCol w:w="4124"/>
+            </w:tblGrid>
+            <w:tr>
+              <w:tc>
+                <w:tcPr>
+                  <w:tcW w:type="dxa" w:w="4242"/>
+                  <w:vAlign w:val="top"/>
+                </w:tcPr>
+                <w:p>
+                  <w:pPr>
+                    <w:spacing w:before="140" w:after="0" w:line="240" w:lineRule="auto"/>
+                    <w:ind w:left="320" w:right="320"/>
+                    <w:jc w:val="center"/>
+                  </w:pPr>
+                  <w:r/>
+                  <w:r>
+                    <w:rPr>
+                      <w:rFonts w:ascii="Times New Roman" w:hAnsi="Times New Roman"/>
+                      <w:b/>
+                      <w:i w:val="0"/>
+                      <w:sz w:val="14"/>
+                    </w:rPr>
+                    <w:t>REPUBLIQUE DU CAMEROUN</w:t>
+                  </w:r>
+                </w:p>
+                <w:p>
+                  <w:pPr>
+                    <w:spacing w:before="0" w:after="0" w:line="240" w:lineRule="auto"/>
+                    <w:ind w:left="320" w:right="320"/>
+                    <w:jc w:val="center"/>
+                  </w:pPr>
+                  <w:r>
+                    <w:rPr>
+                      <w:rFonts w:ascii="Times New Roman" w:hAnsi="Times New Roman"/>
+                      <w:b/>
+                      <w:i/>
+                      <w:sz w:val="18"/>
+                    </w:rPr>
+                    <w:t>Paix – Travail – Patrie</w:t>
+                  </w:r>
+                </w:p>
+                <w:p>
+                  <w:pPr>
+                    <w:spacing w:before="0" w:after="0" w:line="240" w:lineRule="auto"/>
+                    <w:ind w:left="320" w:right="320"/>
+                    <w:jc w:val="center"/>
+                  </w:pPr>
+                  <w:r>
+                    <w:rPr>
+                      <w:rFonts w:ascii="Times New Roman" w:hAnsi="Times New Roman"/>
+                      <w:b/>
+                      <w:i w:val="0"/>
+                      <w:sz w:val="18"/>
+                    </w:rPr>
+                    <w:t>REGION</w:t>
+                  </w:r>
+                </w:p>
+                <w:p>
+                  <w:pPr>
+                    <w:spacing w:before="0" w:after="0" w:line="240" w:lineRule="auto"/>
+                    <w:ind w:left="320" w:right="320"/>
+                    <w:jc w:val="center"/>
+                  </w:pPr>
+                  <w:r>
+                    <w:rPr>
+                      <w:rFonts w:ascii="Times New Roman" w:hAnsi="Times New Roman"/>
+                      <w:b/>
+                      <w:i w:val="0"/>
+                      <w:sz w:val="14"/>
+                    </w:rPr>
+                    <w:t>DELEGATION REGIONALE DES ENSEIGNEMENTS SECONDAIRES</w:t>
+                  </w:r>
+                </w:p>
+                <w:p>
+                  <w:pPr>
+                    <w:spacing w:before="0" w:after="0" w:line="240" w:lineRule="auto"/>
+                    <w:ind w:left="320" w:right="320"/>
+                    <w:jc w:val="center"/>
+                  </w:pPr>
+                  <w:r>
+                    <w:rPr>
+                      <w:rFonts w:ascii="Times New Roman" w:hAnsi="Times New Roman"/>
+                      <w:b/>
+                      <w:i w:val="0"/>
+                      <w:sz w:val="14"/>
+                    </w:rPr>
+                    <w:t>DELEGATION DEPARTEMENTALE</w:t>
+                  </w:r>
+                </w:p>
+                <w:p>
+                  <w:pPr>
+                    <w:spacing w:before="0" w:after="0" w:line="240" w:lineRule="auto"/>
+                    <w:ind w:left="320" w:right="320"/>
+                    <w:jc w:val="center"/>
+                  </w:pPr>
+                  <w:r>
+                    <w:rPr>
+                      <w:rFonts w:ascii="Times New Roman" w:hAnsi="Times New Roman"/>
+                      <w:b/>
+                      <w:i w:val="0"/>
+                      <w:sz w:val="14"/>
+                    </w:rPr>
+                    <w:t>NOM DE L'ETABLISSEMENT</w:t>
+                  </w:r>
+                </w:p>
+              </w:tc>
+              <w:tc>
+                <w:tcPr>
+                  <w:tcW w:type="dxa" w:w="2200"/>
+                  <w:vAlign w:val="top"/>
+                </w:tcPr>
+                <w:p>
+                  <w:pPr>
+                    <w:spacing w:before="0" w:after="0" w:line="240" w:lineRule="auto"/>
+                    <w:jc w:val="center"/>
+                  </w:pPr>
+                </w:p>
+              </w:tc>
+              <w:tc>
+                <w:tcPr>
+                  <w:tcW w:type="dxa" w:w="4124"/>
+                  <w:vAlign w:val="top"/>
+                </w:tcPr>
+                <w:p>
+                  <w:pPr>
+                    <w:spacing w:before="140" w:after="0" w:line="240" w:lineRule="auto"/>
+                    <w:ind w:left="500" w:right="520"/>
+                    <w:jc w:val="center"/>
+                  </w:pPr>
+                  <w:r/>
+                  <w:r>
+                    <w:rPr>
+                      <w:rFonts w:ascii="Times New Roman" w:hAnsi="Times New Roman"/>
+                      <w:b/>
+                      <w:i w:val="0"/>
+                      <w:sz w:val="14"/>
+                    </w:rPr>
+                    <w:t>REPUBLIC OF CAMEROON</w:t>
+                  </w:r>
+                </w:p>
+                <w:p>
+                  <w:pPr>
+                    <w:spacing w:before="0" w:after="0" w:line="240" w:lineRule="auto"/>
+                    <w:ind w:left="500" w:right="520"/>
+                    <w:jc w:val="center"/>
+                  </w:pPr>
+                  <w:r>
+                    <w:rPr>
+                      <w:rFonts w:ascii="Times New Roman" w:hAnsi="Times New Roman"/>
+                      <w:b/>
+                      <w:i/>
+                      <w:sz w:val="14"/>
+                    </w:rPr>
+                    <w:t>Peace – Work – Fatherland</w:t>
+                  </w:r>
+                </w:p>
+                <w:p>
+                  <w:pPr>
+                    <w:spacing w:before="0" w:after="0" w:line="240" w:lineRule="auto"/>
+                    <w:ind w:left="500" w:right="520"/>
+                    <w:jc w:val="center"/>
+                  </w:pPr>
+                  <w:r>
+                    <w:rPr>
+                      <w:rFonts w:ascii="Times New Roman" w:hAnsi="Times New Roman"/>
+                      <w:b/>
+                      <w:i w:val="0"/>
+                      <w:sz w:val="14"/>
+                    </w:rPr>
+                    <w:t>REGION</w:t>
+                  </w:r>
+                </w:p>
+                <w:p>
+                  <w:pPr>
+                    <w:spacing w:before="0" w:after="0" w:line="240" w:lineRule="auto"/>
+                    <w:ind w:left="500" w:right="520"/>
+                    <w:jc w:val="center"/>
+                  </w:pPr>
+                  <w:r>
+                    <w:rPr>
+                      <w:rFonts w:ascii="Times New Roman" w:hAnsi="Times New Roman"/>
+                      <w:b/>
+                      <w:i w:val="0"/>
+                      <w:sz w:val="14"/>
+                    </w:rPr>
+                    <w:t>REGIONAL DELEGATION OF SECONDARY EDUCATION</w:t>
+                  </w:r>
+                </w:p>
+                <w:p>
+                  <w:pPr>
+                    <w:spacing w:before="0" w:after="0" w:line="240" w:lineRule="auto"/>
+                    <w:ind w:left="500" w:right="520"/>
+                    <w:jc w:val="center"/>
+                  </w:pPr>
+                  <w:r>
+                    <w:rPr>
+                      <w:rFonts w:ascii="Times New Roman" w:hAnsi="Times New Roman"/>
+                      <w:b/>
+                      <w:i w:val="0"/>
+                      <w:sz w:val="14"/>
+                    </w:rPr>
+                    <w:t>DIVISIONAL DELEGATION</w:t>
+                  </w:r>
+                </w:p>
+                <w:p>
+                  <w:pPr>
+                    <w:spacing w:before="0" w:after="0" w:line="240" w:lineRule="auto"/>
+                    <w:ind w:left="500" w:right="520"/>
+                    <w:jc w:val="center"/>
+                  </w:pPr>
+                  <w:r>
+                    <w:rPr>
+                      <w:rFonts w:ascii="Times New Roman" w:hAnsi="Times New Roman"/>
+                      <w:b/>
+                      <w:i w:val="0"/>
+                      <w:sz w:val="14"/>
+                    </w:rPr>
+                    <w:t>SCHOOL NAME</w:t>
+                  </w:r>
+                </w:p>
+              </w:tc>
+            </w:tr>
+          </w:tbl>
+          <w:p/>
+        </w:tc>
+      </w:tr>
+      <w:tr>
+        <w:trPr>
+          <w:trHeight w:val="288" w:hRule="exact"/>
+        </w:trPr>
+        <w:tc>
+          <w:tcPr>
+            <w:tcW w:type="dxa" w:w="6602"/>
+            <w:gridSpan w:val="4"/>
+            <w:vAlign w:val="center"/>
+            <w:shd w:val="clear" w:color="auto" w:fill="00B050"/>
+            <w:tcBorders>
+              <w:top w:val="single" w:sz="12" w:space="0" w:color="000000"/>
+              <w:bottom w:val="single" w:sz="12" w:space="0" w:color="000000"/>
+              <w:right w:val="single" w:sz="12" w:space="0" w:color="000000"/>
+            </w:tcBorders>
+          </w:tcPr>
+          <w:p>
+            <w:pPr>
+              <w:spacing w:before="0" w:after="0" w:line="240" w:lineRule="auto"/>
               <w:jc w:val="center"/>
             </w:pPr>
             <w:r/>
             <w:r>
               <w:rPr>
-                <w:rFonts w:ascii="Times New Roman" w:hAnsi="Times New Roman"/>
+                <w:rFonts w:ascii="Times New Roman" w:hAnsi="Times New Roman" w:eastAsia="Times New Roman"/>
                 <w:b/>
                 <w:i w:val="0"/>
-                <w:sz w:val="17"/>
-              </w:rPr>
-              <w:t>REPUBLIQUE DU CAMEROUN</w:t>
-            </w:r>
-          </w:p>
-          <w:p>
-            <w:pPr>
-              <w:jc w:val="center"/>
-            </w:pPr>
-            <w:r>
-              <w:rPr>
-                <w:rFonts w:ascii="Times New Roman" w:hAnsi="Times New Roman"/>
-                <w:b/>
-                <w:i/>
-                <w:sz w:val="17"/>
-              </w:rPr>
-              <w:t>Paix – Travail – Patrie</w:t>
-            </w:r>
-          </w:p>
-          <w:p>
-            <w:pPr>
-              <w:jc w:val="center"/>
-            </w:pPr>
-            <w:r>
-              <w:rPr>
-                <w:rFonts w:ascii="Times New Roman" w:hAnsi="Times New Roman"/>
-                <w:b/>
-                <w:i w:val="0"/>
-                <w:sz w:val="17"/>
-              </w:rPr>
-              <w:t>REGION</w:t>
-            </w:r>
-          </w:p>
-          <w:p>
-            <w:pPr>
-              <w:jc w:val="center"/>
-            </w:pPr>
-            <w:r>
-              <w:rPr>
-                <w:rFonts w:ascii="Times New Roman" w:hAnsi="Times New Roman"/>
-                <w:b/>
-                <w:i w:val="0"/>
-                <w:sz w:val="17"/>
-              </w:rPr>
-              <w:t>DELEGATION REGIONALE DES ENSEIGNEMENTS SECONDAIRES</w:t>
-            </w:r>
-          </w:p>
-          <w:p>
-            <w:pPr>
-              <w:jc w:val="center"/>
-            </w:pPr>
-            <w:r>
-              <w:rPr>
-                <w:rFonts w:ascii="Times New Roman" w:hAnsi="Times New Roman"/>
-                <w:b/>
-                <w:i w:val="0"/>
-                <w:sz w:val="17"/>
-              </w:rPr>
-              <w:t>DELEGATION DEPARTEMENTALE</w:t>
-            </w:r>
-          </w:p>
-          <w:p>
-            <w:pPr>
-              <w:jc w:val="center"/>
-            </w:pPr>
-            <w:r>
-              <w:rPr>
-                <w:rFonts w:ascii="Times New Roman" w:hAnsi="Times New Roman"/>
-                <w:b/>
-                <w:i w:val="0"/>
-                <w:sz w:val="17"/>
-              </w:rPr>
-              <w:t>NOM DE L'ETABLISSEMENT</w:t>
-            </w:r>
-          </w:p>
-        </w:tc>
-        <w:tc>
-          <w:tcPr>
-            <w:tcW w:type="dxa" w:w="3402"/>
-          </w:tcPr>
-          <w:p>
-            <w:r/>
-          </w:p>
-        </w:tc>
-        <w:tc>
-          <w:tcPr>
-            <w:tcW w:type="dxa" w:w="3402"/>
-          </w:tcPr>
-          <w:p>
-            <w:pPr>
-              <w:jc w:val="center"/>
-            </w:pPr>
-            <w:r/>
-            <w:r>
-              <w:rPr>
-                <w:rFonts w:ascii="Times New Roman" w:hAnsi="Times New Roman"/>
-                <w:b/>
-                <w:i w:val="0"/>
-                <w:sz w:val="17"/>
-              </w:rPr>
-              <w:t>REPUBLIC OF CAMEROON</w:t>
-            </w:r>
-          </w:p>
-          <w:p>
-            <w:pPr>
-              <w:jc w:val="center"/>
-            </w:pPr>
-            <w:r>
-              <w:rPr>
-                <w:rFonts w:ascii="Times New Roman" w:hAnsi="Times New Roman"/>
-                <w:b/>
-                <w:i/>
-                <w:sz w:val="17"/>
-              </w:rPr>
-              <w:t>Peace – Work – Fatherland</w:t>
-            </w:r>
-          </w:p>
-          <w:p>
-            <w:pPr>
-              <w:jc w:val="center"/>
-            </w:pPr>
-            <w:r>
-              <w:rPr>
-                <w:rFonts w:ascii="Times New Roman" w:hAnsi="Times New Roman"/>
-                <w:b/>
-                <w:i w:val="0"/>
-                <w:sz w:val="17"/>
-              </w:rPr>
-              <w:t>REGION</w:t>
-            </w:r>
-          </w:p>
-          <w:p>
-            <w:pPr>
-              <w:jc w:val="center"/>
-            </w:pPr>
-            <w:r>
-              <w:rPr>
-                <w:rFonts w:ascii="Times New Roman" w:hAnsi="Times New Roman"/>
-                <w:b/>
-                <w:i w:val="0"/>
-                <w:sz w:val="17"/>
-              </w:rPr>
-              <w:t>REGIONAL DELEGATION OF SECONDARY EDUCATION</w:t>
-            </w:r>
-          </w:p>
-          <w:p>
-            <w:pPr>
-              <w:jc w:val="center"/>
-            </w:pPr>
-            <w:r>
-              <w:rPr>
-                <w:rFonts w:ascii="Times New Roman" w:hAnsi="Times New Roman"/>
-                <w:b/>
-                <w:i w:val="0"/>
-                <w:sz w:val="17"/>
-              </w:rPr>
-              <w:t>DIVISIONAL DELEGATION</w:t>
-            </w:r>
-          </w:p>
-          <w:p>
-            <w:pPr>
-              <w:jc w:val="center"/>
-            </w:pPr>
-            <w:r>
-              <w:rPr>
-                <w:rFonts w:ascii="Times New Roman" w:hAnsi="Times New Roman"/>
-                <w:b/>
-                <w:i w:val="0"/>
-                <w:sz w:val="17"/>
-              </w:rPr>
-              <w:t>SCHOOL NAME</w:t>
-            </w:r>
-          </w:p>
-        </w:tc>
-      </w:tr>
-    </w:tbl>
-    <w:p/>
-    <w:tbl>
-      <w:tblPr>
-        <w:tblW w:type="auto" w:w="0"/>
-        <w:jc w:val="center"/>
-        <w:tblLook w:firstColumn="1" w:firstRow="1" w:lastColumn="0" w:lastRow="0" w:noHBand="0" w:noVBand="1" w:val="04A0"/>
-      </w:tblPr>
-      <w:tblGrid>
-        <w:gridCol w:w="6803"/>
-        <w:gridCol w:w="3402"/>
-      </w:tblGrid>
-      <w:tr>
-        <w:tc>
-          <w:tcPr>
-            <w:tcW w:type="dxa" w:w="5103"/>
-            <w:shd w:val="clear" w:color="auto" w:fill="1F7A3D"/>
-          </w:tcPr>
-          <w:p>
-            <w:pPr>
-              <w:jc w:val="left"/>
-            </w:pPr>
-            <w:r/>
-            <w:r>
-              <w:rPr>
-                <w:rFonts w:ascii="Times New Roman" w:hAnsi="Times New Roman"/>
-                <w:b/>
-                <w:i w:val="0"/>
-                <w:color w:val="FFFFFF"/>
+                <w:color w:val="000000"/>
                 <w:sz w:val="22"/>
               </w:rPr>
               <w:t>BULLETIN DE SOLDE / PAYSLIP</w:t>
@@ -240,20 +336,28 @@
         </w:tc>
         <w:tc>
           <w:tcPr>
-            <w:tcW w:type="dxa" w:w="5103"/>
-            <w:shd w:val="clear" w:color="auto" w:fill="1F7A3D"/>
+            <w:tcW w:type="dxa" w:w="3964"/>
+            <w:gridSpan w:val="3"/>
+            <w:vAlign w:val="center"/>
+            <w:shd w:val="clear" w:color="auto" w:fill="00B050"/>
+            <w:tcBorders>
+              <w:top w:val="single" w:sz="12" w:space="0" w:color="000000"/>
+              <w:bottom w:val="single" w:sz="12" w:space="0" w:color="000000"/>
+              <w:left w:val="single" w:sz="12" w:space="0" w:color="000000"/>
+            </w:tcBorders>
           </w:tcPr>
           <w:p>
             <w:pPr>
+              <w:spacing w:before="0" w:after="0" w:line="240" w:lineRule="auto"/>
               <w:jc w:val="center"/>
             </w:pPr>
             <w:r/>
             <w:r>
               <w:rPr>
-                <w:rFonts w:ascii="Times New Roman" w:hAnsi="Times New Roman"/>
+                <w:rFonts w:ascii="Times New Roman" w:hAnsi="Times New Roman" w:eastAsia="Times New Roman"/>
                 <w:b/>
                 <w:i w:val="0"/>
-                <w:color w:val="FFFFFF"/>
+                <w:color w:val="000000"/>
                 <w:sz w:val="22"/>
               </w:rPr>
               <w:t>{{PERIODE}}</w:t>
@@ -261,48 +365,54 @@
           </w:p>
         </w:tc>
       </w:tr>
-    </w:tbl>
-    <w:tbl>
-      <w:tblPr>
-        <w:tblW w:type="auto" w:w="0"/>
-        <w:jc w:val="center"/>
-        <w:tblLook w:firstColumn="1" w:firstRow="1" w:lastColumn="0" w:lastRow="0" w:noHBand="0" w:noVBand="1" w:val="04A0"/>
-      </w:tblPr>
-      <w:tblGrid>
-        <w:gridCol w:w="6803"/>
-        <w:gridCol w:w="3402"/>
-      </w:tblGrid>
       <w:tr>
+        <w:trPr>
+          <w:trHeight w:val="666" w:hRule="exact"/>
+        </w:trPr>
         <w:tc>
           <w:tcPr>
-            <w:tcW w:type="dxa" w:w="5103"/>
+            <w:tcW w:type="dxa" w:w="5558"/>
+            <w:gridSpan w:val="3"/>
+            <w:vAlign w:val="center"/>
             <w:shd w:val="clear" w:color="auto" w:fill="FFFF00"/>
+            <w:tcBorders>
+              <w:top w:val="single" w:sz="12" w:space="0" w:color="000000"/>
+              <w:bottom w:val="single" w:sz="12" w:space="0" w:color="000000"/>
+              <w:right w:val="single" w:sz="12" w:space="0" w:color="000000"/>
+            </w:tcBorders>
           </w:tcPr>
           <w:p>
             <w:pPr>
+              <w:spacing w:before="0" w:after="0" w:line="240" w:lineRule="auto"/>
               <w:jc w:val="center"/>
             </w:pPr>
             <w:r/>
             <w:r>
               <w:rPr>
-                <w:rFonts w:ascii="Times New Roman" w:hAnsi="Times New Roman"/>
+                <w:rFonts w:ascii="Times New Roman" w:hAnsi="Times New Roman" w:eastAsia="Times New Roman"/>
                 <w:b/>
+                <w:i w:val="0"/>
+                <w:color w:val="000000"/>
                 <w:sz w:val="22"/>
               </w:rPr>
               <w:t>{{NOM}}</w:t>
             </w:r>
             <w:r>
               <w:rPr>
-                <w:rFonts w:ascii="Times New Roman" w:hAnsi="Times New Roman"/>
+                <w:rFonts w:ascii="Times New Roman" w:hAnsi="Times New Roman" w:eastAsia="Times New Roman"/>
                 <w:b/>
+                <w:i w:val="0"/>
+                <w:color w:val="000000"/>
                 <w:sz w:val="22"/>
               </w:rPr>
               <w:t xml:space="preserve"> </w:t>
             </w:r>
             <w:r>
               <w:rPr>
-                <w:rFonts w:ascii="Times New Roman" w:hAnsi="Times New Roman"/>
+                <w:rFonts w:ascii="Times New Roman" w:hAnsi="Times New Roman" w:eastAsia="Times New Roman"/>
                 <w:b/>
+                <w:i w:val="0"/>
+                <w:color w:val="000000"/>
                 <w:sz w:val="22"/>
               </w:rPr>
               <w:t>{{PRENOM}}</w:t>
@@ -311,61 +421,107 @@
         </w:tc>
         <w:tc>
           <w:tcPr>
-            <w:tcW w:type="dxa" w:w="5103"/>
+            <w:tcW w:type="dxa" w:w="5008"/>
+            <w:gridSpan w:val="4"/>
+            <w:vAlign w:val="center"/>
             <w:shd w:val="clear" w:color="auto" w:fill="FFFF00"/>
+            <w:tcBorders>
+              <w:top w:val="single" w:sz="12" w:space="0" w:color="000000"/>
+              <w:bottom w:val="single" w:sz="12" w:space="0" w:color="000000"/>
+              <w:left w:val="single" w:sz="12" w:space="0" w:color="000000"/>
+            </w:tcBorders>
           </w:tcPr>
           <w:p>
             <w:pPr>
+              <w:spacing w:before="0" w:after="0" w:line="240" w:lineRule="auto"/>
               <w:jc w:val="center"/>
             </w:pPr>
             <w:r/>
             <w:r>
               <w:rPr>
-                <w:rFonts w:ascii="Times New Roman" w:hAnsi="Times New Roman"/>
+                <w:rFonts w:ascii="Times New Roman" w:hAnsi="Times New Roman" w:eastAsia="Times New Roman"/>
                 <w:b/>
                 <w:i w:val="0"/>
                 <w:color w:val="000000"/>
                 <w:sz w:val="22"/>
               </w:rPr>
-              <w:t>Statut: {{STATUT}}</w:t>
+              <w:t xml:space="preserve">Statut: </w:t>
+            </w:r>
+            <w:r>
+              <w:rPr>
+                <w:rFonts w:ascii="Times New Roman" w:hAnsi="Times New Roman" w:eastAsia="Times New Roman"/>
+                <w:b/>
+                <w:i w:val="0"/>
+                <w:color w:val="000000"/>
+                <w:sz w:val="22"/>
+              </w:rPr>
+              <w:t>{{STATUT}}</w:t>
             </w:r>
           </w:p>
         </w:tc>
       </w:tr>
-    </w:tbl>
-    <w:p/>
-    <w:tbl>
-      <w:tblPr>
-        <w:tblStyle w:val="TableGrid"/>
-        <w:tblW w:type="auto" w:w="0"/>
-        <w:jc w:val="center"/>
-        <w:tblLook w:firstColumn="1" w:firstRow="1" w:lastColumn="0" w:lastRow="0" w:noHBand="0" w:noVBand="1" w:val="04A0"/>
-      </w:tblPr>
-      <w:tblGrid>
-        <w:gridCol w:w="2551"/>
-        <w:gridCol w:w="2551"/>
-        <w:gridCol w:w="2551"/>
-        <w:gridCol w:w="2551"/>
-      </w:tblGrid>
       <w:tr>
+        <w:trPr>
+          <w:trHeight w:val="288" w:hRule="exact"/>
+        </w:trPr>
         <w:tc>
           <w:tcPr>
-            <w:tcW w:type="dxa" w:w="6123"/>
-            <w:gridSpan w:val="2"/>
-            <w:shd w:val="clear" w:color="auto" w:fill="1F7A3D"/>
+            <w:tcW w:type="dxa" w:w="10566"/>
+            <w:gridSpan w:val="7"/>
+            <w:vAlign w:val="center"/>
+            <w:shd w:val="clear" w:color="auto" w:fill="FFFF00"/>
+            <w:tcBorders>
+              <w:top w:val="single" w:sz="12" w:space="0" w:color="000000"/>
+              <w:bottom w:val="single" w:sz="12" w:space="0" w:color="000000"/>
+            </w:tcBorders>
           </w:tcPr>
           <w:p>
             <w:pPr>
-              <w:jc w:val="left"/>
+              <w:spacing w:before="0" w:after="0" w:line="240" w:lineRule="auto"/>
+              <w:jc w:val="center"/>
             </w:pPr>
             <w:r/>
             <w:r>
               <w:rPr>
-                <w:rFonts w:ascii="Times New Roman" w:hAnsi="Times New Roman"/>
+                <w:rFonts w:ascii="Times New Roman" w:hAnsi="Times New Roman" w:eastAsia="Times New Roman"/>
                 <w:b/>
                 <w:i w:val="0"/>
-                <w:color w:val="FFFFFF"/>
-                <w:sz w:val="20"/>
+                <w:color w:val="000000"/>
+                <w:sz w:val="22"/>
+              </w:rPr>
+            </w:r>
+          </w:p>
+        </w:tc>
+      </w:tr>
+      <w:tr>
+        <w:trPr>
+          <w:trHeight w:val="288" w:hRule="exact"/>
+        </w:trPr>
+        <w:tc>
+          <w:tcPr>
+            <w:tcW w:type="dxa" w:w="6602"/>
+            <w:gridSpan w:val="4"/>
+            <w:vAlign w:val="center"/>
+            <w:shd w:val="clear" w:color="auto" w:fill="00B050"/>
+            <w:tcBorders>
+              <w:top w:val="single" w:sz="12" w:space="0" w:color="000000"/>
+              <w:bottom w:val="single" w:sz="12" w:space="0" w:color="000000"/>
+              <w:right w:val="single" w:sz="12" w:space="0" w:color="000000"/>
+            </w:tcBorders>
+          </w:tcPr>
+          <w:p>
+            <w:pPr>
+              <w:spacing w:before="0" w:after="0" w:line="240" w:lineRule="auto"/>
+              <w:jc w:val="center"/>
+            </w:pPr>
+            <w:r/>
+            <w:r>
+              <w:rPr>
+                <w:rFonts w:ascii="Times New Roman" w:hAnsi="Times New Roman" w:eastAsia="Times New Roman"/>
+                <w:b/>
+                <w:i w:val="0"/>
+                <w:color w:val="000000"/>
+                <w:sz w:val="22"/>
               </w:rPr>
               <w:t>ELEMENTS DE RENUMERATION / SALARY RUBRICS</w:t>
             </w:r>
@@ -373,22 +529,29 @@
         </w:tc>
         <w:tc>
           <w:tcPr>
-            <w:tcW w:type="dxa" w:w="4082"/>
-            <w:gridSpan w:val="2"/>
-            <w:shd w:val="clear" w:color="auto" w:fill="1F7A3D"/>
+            <w:tcW w:type="dxa" w:w="3964"/>
+            <w:gridSpan w:val="3"/>
+            <w:vAlign w:val="center"/>
+            <w:shd w:val="clear" w:color="auto" w:fill="00B050"/>
+            <w:tcBorders>
+              <w:top w:val="single" w:sz="12" w:space="0" w:color="000000"/>
+              <w:bottom w:val="single" w:sz="12" w:space="0" w:color="000000"/>
+              <w:left w:val="single" w:sz="12" w:space="0" w:color="000000"/>
+            </w:tcBorders>
           </w:tcPr>
           <w:p>
             <w:pPr>
+              <w:spacing w:before="0" w:after="0" w:line="240" w:lineRule="auto"/>
               <w:jc w:val="center"/>
             </w:pPr>
             <w:r/>
             <w:r>
               <w:rPr>
-                <w:rFonts w:ascii="Times New Roman" w:hAnsi="Times New Roman"/>
+                <w:rFonts w:ascii="Times New Roman" w:hAnsi="Times New Roman" w:eastAsia="Times New Roman"/>
                 <w:b/>
                 <w:i w:val="0"/>
-                <w:color w:val="FFFFFF"/>
-                <w:sz w:val="20"/>
+                <w:color w:val="000000"/>
+                <w:sz w:val="22"/>
               </w:rPr>
               <w:t>MONTANT / AMOUNT</w:t>
             </w:r>
@@ -396,22 +559,31 @@
         </w:tc>
       </w:tr>
       <w:tr>
+        <w:trPr>
+          <w:trHeight w:val="282" w:hRule="exact"/>
+        </w:trPr>
         <w:tc>
           <w:tcPr>
-            <w:tcW w:type="dxa" w:w="737"/>
+            <w:tcW w:type="dxa" w:w="942"/>
+            <w:vAlign w:val="center"/>
+            <w:tcBorders>
+              <w:top w:val="single" w:sz="12" w:space="0" w:color="000000"/>
+              <w:bottom w:val="single" w:sz="6" w:space="0" w:color="000000"/>
+            </w:tcBorders>
           </w:tcPr>
           <w:p>
             <w:pPr>
+              <w:spacing w:before="0" w:after="0" w:line="240" w:lineRule="auto"/>
               <w:jc w:val="center"/>
             </w:pPr>
             <w:r/>
             <w:r>
               <w:rPr>
-                <w:rFonts w:ascii="Times New Roman" w:hAnsi="Times New Roman"/>
+                <w:rFonts w:ascii="Times New Roman" w:hAnsi="Times New Roman" w:eastAsia="Times New Roman"/>
                 <w:b/>
                 <w:i w:val="0"/>
                 <w:color w:val="000000"/>
-                <w:sz w:val="18"/>
+                <w:sz w:val="22"/>
               </w:rPr>
               <w:t>S/N</w:t>
             </w:r>
@@ -419,20 +591,28 @@
         </w:tc>
         <w:tc>
           <w:tcPr>
-            <w:tcW w:type="dxa" w:w="5386"/>
+            <w:tcW w:type="dxa" w:w="5660"/>
+            <w:gridSpan w:val="3"/>
+            <w:vAlign w:val="center"/>
+            <w:tcBorders>
+              <w:top w:val="single" w:sz="12" w:space="0" w:color="000000"/>
+              <w:bottom w:val="single" w:sz="6" w:space="0" w:color="000000"/>
+            </w:tcBorders>
           </w:tcPr>
           <w:p>
             <w:pPr>
-              <w:jc w:val="center"/>
+              <w:spacing w:before="0" w:after="0" w:line="240" w:lineRule="auto"/>
+              <w:ind w:left="2780"/>
+              <w:jc w:val="left"/>
             </w:pPr>
             <w:r/>
             <w:r>
               <w:rPr>
-                <w:rFonts w:ascii="Times New Roman" w:hAnsi="Times New Roman"/>
+                <w:rFonts w:ascii="Times New Roman" w:hAnsi="Times New Roman" w:eastAsia="Times New Roman"/>
                 <w:b/>
                 <w:i w:val="0"/>
                 <w:color w:val="000000"/>
-                <w:sz w:val="18"/>
+                <w:sz w:val="22"/>
               </w:rPr>
               <w:t>DESIGNATION</w:t>
             </w:r>
@@ -440,20 +620,26 @@
         </w:tc>
         <w:tc>
           <w:tcPr>
-            <w:tcW w:type="dxa" w:w="2041"/>
+            <w:tcW w:type="dxa" w:w="1042"/>
+            <w:vAlign w:val="center"/>
+            <w:tcBorders>
+              <w:top w:val="single" w:sz="12" w:space="0" w:color="000000"/>
+              <w:bottom w:val="single" w:sz="6" w:space="0" w:color="000000"/>
+            </w:tcBorders>
           </w:tcPr>
           <w:p>
             <w:pPr>
+              <w:spacing w:before="0" w:after="0" w:line="240" w:lineRule="auto"/>
               <w:jc w:val="center"/>
             </w:pPr>
             <w:r/>
             <w:r>
               <w:rPr>
-                <w:rFonts w:ascii="Times New Roman" w:hAnsi="Times New Roman"/>
+                <w:rFonts w:ascii="Times New Roman" w:hAnsi="Times New Roman" w:eastAsia="Times New Roman"/>
                 <w:b/>
                 <w:i w:val="0"/>
                 <w:color w:val="000000"/>
-                <w:sz w:val="18"/>
+                <w:sz w:val="22"/>
               </w:rPr>
               <w:t>GAINS</w:t>
             </w:r>
@@ -461,20 +647,52 @@
         </w:tc>
         <w:tc>
           <w:tcPr>
-            <w:tcW w:type="dxa" w:w="2041"/>
+            <w:tcW w:type="dxa" w:w="1046"/>
+            <w:vAlign w:val="center"/>
+            <w:tcBorders>
+              <w:top w:val="single" w:sz="12" w:space="0" w:color="000000"/>
+              <w:bottom w:val="single" w:sz="6" w:space="0" w:color="000000"/>
+            </w:tcBorders>
           </w:tcPr>
           <w:p>
             <w:pPr>
+              <w:spacing w:before="0" w:after="0" w:line="240" w:lineRule="auto"/>
               <w:jc w:val="center"/>
             </w:pPr>
             <w:r/>
             <w:r>
               <w:rPr>
-                <w:rFonts w:ascii="Times New Roman" w:hAnsi="Times New Roman"/>
+                <w:rFonts w:ascii="Times New Roman" w:hAnsi="Times New Roman" w:eastAsia="Times New Roman"/>
                 <w:b/>
                 <w:i w:val="0"/>
                 <w:color w:val="000000"/>
-                <w:sz w:val="18"/>
+                <w:sz w:val="22"/>
+              </w:rPr>
+            </w:r>
+          </w:p>
+        </w:tc>
+        <w:tc>
+          <w:tcPr>
+            <w:tcW w:type="dxa" w:w="1876"/>
+            <w:vAlign w:val="center"/>
+            <w:tcBorders>
+              <w:top w:val="single" w:sz="12" w:space="0" w:color="000000"/>
+              <w:bottom w:val="single" w:sz="6" w:space="0" w:color="000000"/>
+            </w:tcBorders>
+          </w:tcPr>
+          <w:p>
+            <w:pPr>
+              <w:spacing w:before="0" w:after="0" w:line="240" w:lineRule="auto"/>
+              <w:jc w:val="center"/>
+            </w:pPr>
+            <w:r/>
+            <w:r>
+              <w:rPr>
+                <w:rFonts w:ascii="Times New Roman" w:hAnsi="Times New Roman" w:eastAsia="Times New Roman"/>
+                <w:b/>
+                <w:i w:val="0"/>
+                <w:color w:val="000000"/>
+                <w:sz w:val="22"/>
               </w:rPr>
               <w:t>RETENUES</w:t>
             </w:r>
@@ -482,22 +700,27 @@
         </w:tc>
       </w:tr>
       <w:tr>
+        <w:trPr>
+          <w:trHeight w:val="546" w:hRule="exact"/>
+        </w:trPr>
         <w:tc>
           <w:tcPr>
-            <w:tcW w:type="dxa" w:w="737"/>
+            <w:tcW w:type="dxa" w:w="942"/>
+            <w:vAlign w:val="top"/>
           </w:tcPr>
           <w:p>
             <w:pPr>
+              <w:spacing w:before="0" w:after="0" w:line="240" w:lineRule="auto"/>
               <w:jc w:val="center"/>
             </w:pPr>
             <w:r/>
             <w:r>
               <w:rPr>
-                <w:rFonts w:ascii="Times New Roman" w:hAnsi="Times New Roman"/>
-                <w:b w:val="0"/>
+                <w:rFonts w:ascii="Times New Roman" w:hAnsi="Times New Roman" w:eastAsia="Times New Roman"/>
+                <w:b/>
                 <w:i w:val="0"/>
                 <w:color w:val="000000"/>
-                <w:sz w:val="18"/>
+                <w:sz w:val="22"/>
               </w:rPr>
               <w:t>1</w:t>
             </w:r>
@@ -505,20 +728,24 @@
         </w:tc>
         <w:tc>
           <w:tcPr>
-            <w:tcW w:type="dxa" w:w="5386"/>
+            <w:tcW w:type="dxa" w:w="4616"/>
+            <w:gridSpan w:val="2"/>
+            <w:vAlign w:val="top"/>
           </w:tcPr>
           <w:p>
             <w:pPr>
+              <w:spacing w:before="0" w:after="0" w:line="240" w:lineRule="auto"/>
+              <w:ind w:left="80"/>
               <w:jc w:val="left"/>
             </w:pPr>
             <w:r/>
             <w:r>
               <w:rPr>
-                <w:rFonts w:ascii="Times New Roman" w:hAnsi="Times New Roman"/>
+                <w:rFonts w:ascii="Times New Roman" w:hAnsi="Times New Roman" w:eastAsia="Times New Roman"/>
                 <w:b/>
                 <w:i w:val="0"/>
                 <w:color w:val="000000"/>
-                <w:sz w:val="18"/>
+                <w:sz w:val="22"/>
               </w:rPr>
               <w:t>Gain Heures / Hourly Wage</w:t>
             </w:r>
@@ -526,63 +753,118 @@
         </w:tc>
         <w:tc>
           <w:tcPr>
-            <w:tcW w:type="dxa" w:w="2041"/>
+            <w:tcW w:type="dxa" w:w="1044"/>
+            <w:vAlign w:val="top"/>
           </w:tcPr>
           <w:p>
             <w:pPr>
+              <w:spacing w:before="0" w:after="0" w:line="240" w:lineRule="auto"/>
               <w:jc w:val="center"/>
             </w:pPr>
             <w:r/>
             <w:r>
               <w:rPr>
-                <w:rFonts w:ascii="Times New Roman" w:hAnsi="Times New Roman"/>
-                <w:b w:val="0"/>
+                <w:rFonts w:ascii="Times New Roman" w:hAnsi="Times New Roman" w:eastAsia="Times New Roman"/>
+                <w:b/>
                 <w:i w:val="0"/>
                 <w:color w:val="000000"/>
-                <w:sz w:val="18"/>
+                <w:sz w:val="22"/>
               </w:rPr>
-              <w:t>{{TOTAL_HEURES}}   {{TAUX_HORAIRE}}   {{GAIN_HEURES}}</w:t>
+              <w:t>{{TOTAL_HEURES}}</w:t>
             </w:r>
           </w:p>
         </w:tc>
         <w:tc>
           <w:tcPr>
-            <w:tcW w:type="dxa" w:w="2041"/>
+            <w:tcW w:type="dxa" w:w="1042"/>
+            <w:vAlign w:val="top"/>
           </w:tcPr>
           <w:p>
             <w:pPr>
+              <w:spacing w:before="0" w:after="0" w:line="240" w:lineRule="auto"/>
               <w:jc w:val="center"/>
             </w:pPr>
             <w:r/>
             <w:r>
               <w:rPr>
-                <w:rFonts w:ascii="Times New Roman" w:hAnsi="Times New Roman"/>
-                <w:b w:val="0"/>
+                <w:rFonts w:ascii="Times New Roman" w:hAnsi="Times New Roman" w:eastAsia="Times New Roman"/>
+                <w:b/>
                 <w:i w:val="0"/>
                 <w:color w:val="000000"/>
-                <w:sz w:val="18"/>
+                <w:sz w:val="22"/>
+              </w:rPr>
+              <w:t>{{TAUX_HORAIRE}}</w:t>
+            </w:r>
+          </w:p>
+        </w:tc>
+        <w:tc>
+          <w:tcPr>
+            <w:tcW w:type="dxa" w:w="1046"/>
+            <w:vAlign w:val="top"/>
+          </w:tcPr>
+          <w:p>
+            <w:pPr>
+              <w:spacing w:before="0" w:after="0" w:line="240" w:lineRule="auto"/>
+              <w:jc w:val="center"/>
+            </w:pPr>
+            <w:r/>
+            <w:r>
+              <w:rPr>
+                <w:rFonts w:ascii="Times New Roman" w:hAnsi="Times New Roman" w:eastAsia="Times New Roman"/>
+                <w:b/>
+                <w:i w:val="0"/>
+                <w:color w:val="000000"/>
+                <w:sz w:val="22"/>
+              </w:rPr>
+              <w:t>{{GAIN_HEURES}}</w:t>
+            </w:r>
+          </w:p>
+        </w:tc>
+        <w:tc>
+          <w:tcPr>
+            <w:tcW w:type="dxa" w:w="1876"/>
+            <w:vAlign w:val="top"/>
+          </w:tcPr>
+          <w:p>
+            <w:pPr>
+              <w:spacing w:before="0" w:after="0" w:line="240" w:lineRule="auto"/>
+              <w:jc w:val="center"/>
+            </w:pPr>
+            <w:r/>
+            <w:r>
+              <w:rPr>
+                <w:rFonts w:ascii="Times New Roman" w:hAnsi="Times New Roman" w:eastAsia="Times New Roman"/>
+                <w:b/>
+                <w:i w:val="0"/>
+                <w:color w:val="000000"/>
+                <w:sz w:val="22"/>
               </w:rPr>
             </w:r>
           </w:p>
         </w:tc>
       </w:tr>
       <w:tr>
+        <w:trPr>
+          <w:trHeight w:val="546" w:hRule="exact"/>
+        </w:trPr>
         <w:tc>
           <w:tcPr>
-            <w:tcW w:type="dxa" w:w="737"/>
+            <w:tcW w:type="dxa" w:w="942"/>
+            <w:vAlign w:val="top"/>
           </w:tcPr>
           <w:p>
             <w:pPr>
+              <w:spacing w:before="0" w:after="0" w:line="240" w:lineRule="auto"/>
               <w:jc w:val="center"/>
             </w:pPr>
             <w:r/>
             <w:r>
               <w:rPr>
-                <w:rFonts w:ascii="Times New Roman" w:hAnsi="Times New Roman"/>
-                <w:b w:val="0"/>
+                <w:rFonts w:ascii="Times New Roman" w:hAnsi="Times New Roman" w:eastAsia="Times New Roman"/>
+                <w:b/>
                 <w:i w:val="0"/>
                 <w:color w:val="000000"/>
-                <w:sz w:val="18"/>
+                <w:sz w:val="22"/>
               </w:rPr>
               <w:t>2</w:t>
             </w:r>
@@ -590,20 +872,23 @@
         </w:tc>
         <w:tc>
           <w:tcPr>
-            <w:tcW w:type="dxa" w:w="5386"/>
+            <w:tcW w:type="dxa" w:w="4616"/>
+            <w:gridSpan w:val="2"/>
+            <w:vAlign w:val="top"/>
           </w:tcPr>
           <w:p>
             <w:pPr>
+              <w:spacing w:before="0" w:after="0" w:line="240" w:lineRule="auto"/>
               <w:jc w:val="left"/>
             </w:pPr>
             <w:r/>
             <w:r>
               <w:rPr>
-                <w:rFonts w:ascii="Times New Roman" w:hAnsi="Times New Roman"/>
+                <w:rFonts w:ascii="Times New Roman" w:hAnsi="Times New Roman" w:eastAsia="Times New Roman"/>
                 <w:b/>
                 <w:i w:val="0"/>
                 <w:color w:val="000000"/>
-                <w:sz w:val="18"/>
+                <w:sz w:val="22"/>
               </w:rPr>
               <w:t>Prime AP/PP / Incentive HOD/CM</w:t>
             </w:r>
@@ -611,20 +896,66 @@
         </w:tc>
         <w:tc>
           <w:tcPr>
-            <w:tcW w:type="dxa" w:w="2041"/>
+            <w:tcW w:type="dxa" w:w="1044"/>
+            <w:vAlign w:val="top"/>
           </w:tcPr>
           <w:p>
             <w:pPr>
+              <w:spacing w:before="0" w:after="0" w:line="240" w:lineRule="auto"/>
               <w:jc w:val="center"/>
             </w:pPr>
             <w:r/>
             <w:r>
               <w:rPr>
-                <w:rFonts w:ascii="Times New Roman" w:hAnsi="Times New Roman"/>
-                <w:b w:val="0"/>
+                <w:rFonts w:ascii="Times New Roman" w:hAnsi="Times New Roman" w:eastAsia="Times New Roman"/>
+                <w:b/>
                 <w:i w:val="0"/>
                 <w:color w:val="000000"/>
-                <w:sz w:val="18"/>
+                <w:sz w:val="22"/>
+              </w:rPr>
+            </w:r>
+          </w:p>
+        </w:tc>
+        <w:tc>
+          <w:tcPr>
+            <w:tcW w:type="dxa" w:w="1042"/>
+            <w:vAlign w:val="top"/>
+          </w:tcPr>
+          <w:p>
+            <w:pPr>
+              <w:spacing w:before="0" w:after="0" w:line="240" w:lineRule="auto"/>
+              <w:jc w:val="center"/>
+            </w:pPr>
+            <w:r/>
+            <w:r>
+              <w:rPr>
+                <w:rFonts w:ascii="Times New Roman" w:hAnsi="Times New Roman" w:eastAsia="Times New Roman"/>
+                <w:b/>
+                <w:i w:val="0"/>
+                <w:color w:val="000000"/>
+                <w:sz w:val="22"/>
+              </w:rPr>
+            </w:r>
+          </w:p>
+        </w:tc>
+        <w:tc>
+          <w:tcPr>
+            <w:tcW w:type="dxa" w:w="1046"/>
+            <w:vAlign w:val="top"/>
+          </w:tcPr>
+          <w:p>
+            <w:pPr>
+              <w:spacing w:before="0" w:after="0" w:line="240" w:lineRule="auto"/>
+              <w:jc w:val="center"/>
+            </w:pPr>
+            <w:r/>
+            <w:r>
+              <w:rPr>
+                <w:rFonts w:ascii="Times New Roman" w:hAnsi="Times New Roman" w:eastAsia="Times New Roman"/>
+                <w:b/>
+                <w:i w:val="0"/>
+                <w:color w:val="000000"/>
+                <w:sz w:val="22"/>
               </w:rPr>
               <w:t>{{PRIME_AP_PP}}</w:t>
             </w:r>
@@ -632,42 +963,49 @@
         </w:tc>
         <w:tc>
           <w:tcPr>
-            <w:tcW w:type="dxa" w:w="2041"/>
+            <w:tcW w:type="dxa" w:w="1876"/>
+            <w:vAlign w:val="top"/>
           </w:tcPr>
           <w:p>
             <w:pPr>
+              <w:spacing w:before="0" w:after="0" w:line="240" w:lineRule="auto"/>
               <w:jc w:val="center"/>
             </w:pPr>
             <w:r/>
             <w:r>
               <w:rPr>
-                <w:rFonts w:ascii="Times New Roman" w:hAnsi="Times New Roman"/>
-                <w:b w:val="0"/>
+                <w:rFonts w:ascii="Times New Roman" w:hAnsi="Times New Roman" w:eastAsia="Times New Roman"/>
+                <w:b/>
                 <w:i w:val="0"/>
                 <w:color w:val="000000"/>
-                <w:sz w:val="18"/>
+                <w:sz w:val="22"/>
               </w:rPr>
             </w:r>
           </w:p>
         </w:tc>
       </w:tr>
       <w:tr>
+        <w:trPr>
+          <w:trHeight w:val="546" w:hRule="exact"/>
+        </w:trPr>
         <w:tc>
           <w:tcPr>
-            <w:tcW w:type="dxa" w:w="737"/>
+            <w:tcW w:type="dxa" w:w="942"/>
+            <w:vAlign w:val="top"/>
           </w:tcPr>
           <w:p>
             <w:pPr>
+              <w:spacing w:before="0" w:after="0" w:line="240" w:lineRule="auto"/>
               <w:jc w:val="center"/>
             </w:pPr>
             <w:r/>
             <w:r>
               <w:rPr>
-                <w:rFonts w:ascii="Times New Roman" w:hAnsi="Times New Roman"/>
-                <w:b w:val="0"/>
+                <w:rFonts w:ascii="Times New Roman" w:hAnsi="Times New Roman" w:eastAsia="Times New Roman"/>
+                <w:b/>
                 <w:i w:val="0"/>
                 <w:color w:val="000000"/>
-                <w:sz w:val="18"/>
+                <w:sz w:val="22"/>
               </w:rPr>
               <w:t>3</w:t>
             </w:r>
@@ -675,20 +1013,23 @@
         </w:tc>
         <w:tc>
           <w:tcPr>
-            <w:tcW w:type="dxa" w:w="5386"/>
+            <w:tcW w:type="dxa" w:w="4616"/>
+            <w:gridSpan w:val="2"/>
+            <w:vAlign w:val="top"/>
           </w:tcPr>
           <w:p>
             <w:pPr>
+              <w:spacing w:before="0" w:after="0" w:line="240" w:lineRule="auto"/>
               <w:jc w:val="left"/>
             </w:pPr>
             <w:r/>
             <w:r>
               <w:rPr>
-                <w:rFonts w:ascii="Times New Roman" w:hAnsi="Times New Roman"/>
+                <w:rFonts w:ascii="Times New Roman" w:hAnsi="Times New Roman" w:eastAsia="Times New Roman"/>
                 <w:b/>
                 <w:i w:val="0"/>
                 <w:color w:val="000000"/>
-                <w:sz w:val="18"/>
+                <w:sz w:val="22"/>
               </w:rPr>
               <w:t>Surveillance/Secretariat / Invigilation</w:t>
             </w:r>
@@ -696,20 +1037,66 @@
         </w:tc>
         <w:tc>
           <w:tcPr>
-            <w:tcW w:type="dxa" w:w="2041"/>
+            <w:tcW w:type="dxa" w:w="1044"/>
+            <w:vAlign w:val="top"/>
           </w:tcPr>
           <w:p>
             <w:pPr>
+              <w:spacing w:before="0" w:after="0" w:line="240" w:lineRule="auto"/>
               <w:jc w:val="center"/>
             </w:pPr>
             <w:r/>
             <w:r>
               <w:rPr>
-                <w:rFonts w:ascii="Times New Roman" w:hAnsi="Times New Roman"/>
-                <w:b w:val="0"/>
+                <w:rFonts w:ascii="Times New Roman" w:hAnsi="Times New Roman" w:eastAsia="Times New Roman"/>
+                <w:b/>
                 <w:i w:val="0"/>
                 <w:color w:val="000000"/>
-                <w:sz w:val="18"/>
+                <w:sz w:val="22"/>
+              </w:rPr>
+            </w:r>
+          </w:p>
+        </w:tc>
+        <w:tc>
+          <w:tcPr>
+            <w:tcW w:type="dxa" w:w="1042"/>
+            <w:vAlign w:val="top"/>
+          </w:tcPr>
+          <w:p>
+            <w:pPr>
+              <w:spacing w:before="0" w:after="0" w:line="240" w:lineRule="auto"/>
+              <w:jc w:val="center"/>
+            </w:pPr>
+            <w:r/>
+            <w:r>
+              <w:rPr>
+                <w:rFonts w:ascii="Times New Roman" w:hAnsi="Times New Roman" w:eastAsia="Times New Roman"/>
+                <w:b/>
+                <w:i w:val="0"/>
+                <w:color w:val="000000"/>
+                <w:sz w:val="22"/>
+              </w:rPr>
+            </w:r>
+          </w:p>
+        </w:tc>
+        <w:tc>
+          <w:tcPr>
+            <w:tcW w:type="dxa" w:w="1046"/>
+            <w:vAlign w:val="top"/>
+          </w:tcPr>
+          <w:p>
+            <w:pPr>
+              <w:spacing w:before="0" w:after="0" w:line="240" w:lineRule="auto"/>
+              <w:jc w:val="center"/>
+            </w:pPr>
+            <w:r/>
+            <w:r>
+              <w:rPr>
+                <w:rFonts w:ascii="Times New Roman" w:hAnsi="Times New Roman" w:eastAsia="Times New Roman"/>
+                <w:b/>
+                <w:i w:val="0"/>
+                <w:color w:val="000000"/>
+                <w:sz w:val="22"/>
               </w:rPr>
               <w:t>{{SURVEILLANCE_SECRETARIAT}}</w:t>
             </w:r>
@@ -717,42 +1104,49 @@
         </w:tc>
         <w:tc>
           <w:tcPr>
-            <w:tcW w:type="dxa" w:w="2041"/>
+            <w:tcW w:type="dxa" w:w="1876"/>
+            <w:vAlign w:val="top"/>
           </w:tcPr>
           <w:p>
             <w:pPr>
+              <w:spacing w:before="0" w:after="0" w:line="240" w:lineRule="auto"/>
               <w:jc w:val="center"/>
             </w:pPr>
             <w:r/>
             <w:r>
               <w:rPr>
-                <w:rFonts w:ascii="Times New Roman" w:hAnsi="Times New Roman"/>
-                <w:b w:val="0"/>
+                <w:rFonts w:ascii="Times New Roman" w:hAnsi="Times New Roman" w:eastAsia="Times New Roman"/>
+                <w:b/>
                 <w:i w:val="0"/>
                 <w:color w:val="000000"/>
-                <w:sz w:val="18"/>
+                <w:sz w:val="22"/>
               </w:rPr>
             </w:r>
           </w:p>
         </w:tc>
       </w:tr>
       <w:tr>
+        <w:trPr>
+          <w:trHeight w:val="546" w:hRule="exact"/>
+        </w:trPr>
         <w:tc>
           <w:tcPr>
-            <w:tcW w:type="dxa" w:w="737"/>
+            <w:tcW w:type="dxa" w:w="942"/>
+            <w:vAlign w:val="top"/>
           </w:tcPr>
           <w:p>
             <w:pPr>
+              <w:spacing w:before="0" w:after="0" w:line="240" w:lineRule="auto"/>
               <w:jc w:val="center"/>
             </w:pPr>
             <w:r/>
             <w:r>
               <w:rPr>
-                <w:rFonts w:ascii="Times New Roman" w:hAnsi="Times New Roman"/>
-                <w:b w:val="0"/>
+                <w:rFonts w:ascii="Times New Roman" w:hAnsi="Times New Roman" w:eastAsia="Times New Roman"/>
+                <w:b/>
                 <w:i w:val="0"/>
                 <w:color w:val="000000"/>
-                <w:sz w:val="18"/>
+                <w:sz w:val="22"/>
               </w:rPr>
               <w:t>4</w:t>
             </w:r>
@@ -760,20 +1154,23 @@
         </w:tc>
         <w:tc>
           <w:tcPr>
-            <w:tcW w:type="dxa" w:w="5386"/>
+            <w:tcW w:type="dxa" w:w="4616"/>
+            <w:gridSpan w:val="2"/>
+            <w:vAlign w:val="top"/>
           </w:tcPr>
           <w:p>
             <w:pPr>
+              <w:spacing w:before="0" w:after="0" w:line="240" w:lineRule="auto"/>
               <w:jc w:val="left"/>
             </w:pPr>
             <w:r/>
             <w:r>
               <w:rPr>
-                <w:rFonts w:ascii="Times New Roman" w:hAnsi="Times New Roman"/>
+                <w:rFonts w:ascii="Times New Roman" w:hAnsi="Times New Roman" w:eastAsia="Times New Roman"/>
                 <w:b/>
                 <w:i w:val="0"/>
                 <w:color w:val="000000"/>
-                <w:sz w:val="18"/>
+                <w:sz w:val="22"/>
               </w:rPr>
               <w:t>Indemnite Suggestion / Duty Post Allowance</w:t>
             </w:r>
@@ -781,20 +1178,66 @@
         </w:tc>
         <w:tc>
           <w:tcPr>
-            <w:tcW w:type="dxa" w:w="2041"/>
+            <w:tcW w:type="dxa" w:w="1044"/>
+            <w:vAlign w:val="top"/>
           </w:tcPr>
           <w:p>
             <w:pPr>
+              <w:spacing w:before="0" w:after="0" w:line="240" w:lineRule="auto"/>
               <w:jc w:val="center"/>
             </w:pPr>
             <w:r/>
             <w:r>
               <w:rPr>
-                <w:rFonts w:ascii="Times New Roman" w:hAnsi="Times New Roman"/>
-                <w:b w:val="0"/>
+                <w:rFonts w:ascii="Times New Roman" w:hAnsi="Times New Roman" w:eastAsia="Times New Roman"/>
+                <w:b/>
                 <w:i w:val="0"/>
                 <w:color w:val="000000"/>
-                <w:sz w:val="18"/>
+                <w:sz w:val="22"/>
+              </w:rPr>
+            </w:r>
+          </w:p>
+        </w:tc>
+        <w:tc>
+          <w:tcPr>
+            <w:tcW w:type="dxa" w:w="1042"/>
+            <w:vAlign w:val="top"/>
+          </w:tcPr>
+          <w:p>
+            <w:pPr>
+              <w:spacing w:before="0" w:after="0" w:line="240" w:lineRule="auto"/>
+              <w:jc w:val="center"/>
+            </w:pPr>
+            <w:r/>
+            <w:r>
+              <w:rPr>
+                <w:rFonts w:ascii="Times New Roman" w:hAnsi="Times New Roman" w:eastAsia="Times New Roman"/>
+                <w:b/>
+                <w:i w:val="0"/>
+                <w:color w:val="000000"/>
+                <w:sz w:val="22"/>
+              </w:rPr>
+            </w:r>
+          </w:p>
+        </w:tc>
+        <w:tc>
+          <w:tcPr>
+            <w:tcW w:type="dxa" w:w="1046"/>
+            <w:vAlign w:val="top"/>
+          </w:tcPr>
+          <w:p>
+            <w:pPr>
+              <w:spacing w:before="0" w:after="0" w:line="240" w:lineRule="auto"/>
+              <w:jc w:val="center"/>
+            </w:pPr>
+            <w:r/>
+            <w:r>
+              <w:rPr>
+                <w:rFonts w:ascii="Times New Roman" w:hAnsi="Times New Roman" w:eastAsia="Times New Roman"/>
+                <w:b/>
+                <w:i w:val="0"/>
+                <w:color w:val="000000"/>
+                <w:sz w:val="22"/>
               </w:rPr>
               <w:t>{{INDEMNITE_SUGGESTION_ADMIN}}</w:t>
             </w:r>
@@ -802,42 +1245,49 @@
         </w:tc>
         <w:tc>
           <w:tcPr>
-            <w:tcW w:type="dxa" w:w="2041"/>
+            <w:tcW w:type="dxa" w:w="1876"/>
+            <w:vAlign w:val="top"/>
           </w:tcPr>
           <w:p>
             <w:pPr>
+              <w:spacing w:before="0" w:after="0" w:line="240" w:lineRule="auto"/>
               <w:jc w:val="center"/>
             </w:pPr>
             <w:r/>
             <w:r>
               <w:rPr>
-                <w:rFonts w:ascii="Times New Roman" w:hAnsi="Times New Roman"/>
-                <w:b w:val="0"/>
+                <w:rFonts w:ascii="Times New Roman" w:hAnsi="Times New Roman" w:eastAsia="Times New Roman"/>
+                <w:b/>
                 <w:i w:val="0"/>
                 <w:color w:val="000000"/>
-                <w:sz w:val="18"/>
+                <w:sz w:val="22"/>
               </w:rPr>
             </w:r>
           </w:p>
         </w:tc>
       </w:tr>
       <w:tr>
+        <w:trPr>
+          <w:trHeight w:val="546" w:hRule="exact"/>
+        </w:trPr>
         <w:tc>
           <w:tcPr>
-            <w:tcW w:type="dxa" w:w="737"/>
+            <w:tcW w:type="dxa" w:w="942"/>
+            <w:vAlign w:val="top"/>
           </w:tcPr>
           <w:p>
             <w:pPr>
+              <w:spacing w:before="0" w:after="0" w:line="240" w:lineRule="auto"/>
               <w:jc w:val="center"/>
             </w:pPr>
             <w:r/>
             <w:r>
               <w:rPr>
-                <w:rFonts w:ascii="Times New Roman" w:hAnsi="Times New Roman"/>
-                <w:b w:val="0"/>
+                <w:rFonts w:ascii="Times New Roman" w:hAnsi="Times New Roman" w:eastAsia="Times New Roman"/>
+                <w:b/>
                 <w:i w:val="0"/>
                 <w:color w:val="000000"/>
-                <w:sz w:val="18"/>
+                <w:sz w:val="22"/>
               </w:rPr>
               <w:t>5</w:t>
             </w:r>
@@ -845,20 +1295,23 @@
         </w:tc>
         <w:tc>
           <w:tcPr>
-            <w:tcW w:type="dxa" w:w="5386"/>
+            <w:tcW w:type="dxa" w:w="4616"/>
+            <w:gridSpan w:val="2"/>
+            <w:vAlign w:val="top"/>
           </w:tcPr>
           <w:p>
             <w:pPr>
+              <w:spacing w:before="0" w:after="0" w:line="240" w:lineRule="auto"/>
               <w:jc w:val="left"/>
             </w:pPr>
             <w:r/>
             <w:r>
               <w:rPr>
-                <w:rFonts w:ascii="Times New Roman" w:hAnsi="Times New Roman"/>
+                <w:rFonts w:ascii="Times New Roman" w:hAnsi="Times New Roman" w:eastAsia="Times New Roman"/>
                 <w:b/>
                 <w:i w:val="0"/>
                 <w:color w:val="000000"/>
-                <w:sz w:val="18"/>
+                <w:sz w:val="22"/>
               </w:rPr>
               <w:t>Taxe / Tax</w:t>
             </w:r>
@@ -866,40 +1319,88 @@
         </w:tc>
         <w:tc>
           <w:tcPr>
-            <w:tcW w:type="dxa" w:w="2041"/>
+            <w:tcW w:type="dxa" w:w="1044"/>
+            <w:vAlign w:val="top"/>
           </w:tcPr>
           <w:p>
             <w:pPr>
+              <w:spacing w:before="0" w:after="0" w:line="240" w:lineRule="auto"/>
               <w:jc w:val="center"/>
             </w:pPr>
             <w:r/>
             <w:r>
               <w:rPr>
-                <w:rFonts w:ascii="Times New Roman" w:hAnsi="Times New Roman"/>
-                <w:b w:val="0"/>
+                <w:rFonts w:ascii="Times New Roman" w:hAnsi="Times New Roman" w:eastAsia="Times New Roman"/>
+                <w:b/>
                 <w:i w:val="0"/>
                 <w:color w:val="000000"/>
-                <w:sz w:val="18"/>
+                <w:sz w:val="22"/>
               </w:rPr>
             </w:r>
           </w:p>
         </w:tc>
         <w:tc>
           <w:tcPr>
-            <w:tcW w:type="dxa" w:w="2041"/>
+            <w:tcW w:type="dxa" w:w="1042"/>
+            <w:vAlign w:val="top"/>
           </w:tcPr>
           <w:p>
             <w:pPr>
+              <w:spacing w:before="0" w:after="0" w:line="240" w:lineRule="auto"/>
               <w:jc w:val="center"/>
             </w:pPr>
             <w:r/>
             <w:r>
               <w:rPr>
-                <w:rFonts w:ascii="Times New Roman" w:hAnsi="Times New Roman"/>
-                <w:b w:val="0"/>
+                <w:rFonts w:ascii="Times New Roman" w:hAnsi="Times New Roman" w:eastAsia="Times New Roman"/>
+                <w:b/>
                 <w:i w:val="0"/>
                 <w:color w:val="000000"/>
-                <w:sz w:val="18"/>
+                <w:sz w:val="22"/>
+              </w:rPr>
+            </w:r>
+          </w:p>
+        </w:tc>
+        <w:tc>
+          <w:tcPr>
+            <w:tcW w:type="dxa" w:w="1046"/>
+            <w:vAlign w:val="top"/>
+          </w:tcPr>
+          <w:p>
+            <w:pPr>
+              <w:spacing w:before="0" w:after="0" w:line="240" w:lineRule="auto"/>
+              <w:jc w:val="center"/>
+            </w:pPr>
+            <w:r/>
+            <w:r>
+              <w:rPr>
+                <w:rFonts w:ascii="Times New Roman" w:hAnsi="Times New Roman" w:eastAsia="Times New Roman"/>
+                <w:b/>
+                <w:i w:val="0"/>
+                <w:color w:val="000000"/>
+                <w:sz w:val="22"/>
+              </w:rPr>
+            </w:r>
+          </w:p>
+        </w:tc>
+        <w:tc>
+          <w:tcPr>
+            <w:tcW w:type="dxa" w:w="1876"/>
+            <w:vAlign w:val="top"/>
+          </w:tcPr>
+          <w:p>
+            <w:pPr>
+              <w:spacing w:before="0" w:after="0" w:line="240" w:lineRule="auto"/>
+              <w:jc w:val="center"/>
+            </w:pPr>
+            <w:r/>
+            <w:r>
+              <w:rPr>
+                <w:rFonts w:ascii="Times New Roman" w:hAnsi="Times New Roman" w:eastAsia="Times New Roman"/>
+                <w:b/>
+                <w:i w:val="0"/>
+                <w:color w:val="000000"/>
+                <w:sz w:val="22"/>
               </w:rPr>
               <w:t>{{TAXE_5}}</w:t>
             </w:r>
@@ -907,22 +1408,27 @@
         </w:tc>
       </w:tr>
       <w:tr>
+        <w:trPr>
+          <w:trHeight w:val="546" w:hRule="exact"/>
+        </w:trPr>
         <w:tc>
           <w:tcPr>
-            <w:tcW w:type="dxa" w:w="737"/>
+            <w:tcW w:type="dxa" w:w="942"/>
+            <w:vAlign w:val="top"/>
           </w:tcPr>
           <w:p>
             <w:pPr>
+              <w:spacing w:before="0" w:after="0" w:line="240" w:lineRule="auto"/>
               <w:jc w:val="center"/>
             </w:pPr>
             <w:r/>
             <w:r>
               <w:rPr>
-                <w:rFonts w:ascii="Times New Roman" w:hAnsi="Times New Roman"/>
-                <w:b w:val="0"/>
+                <w:rFonts w:ascii="Times New Roman" w:hAnsi="Times New Roman" w:eastAsia="Times New Roman"/>
+                <w:b/>
                 <w:i w:val="0"/>
                 <w:color w:val="000000"/>
-                <w:sz w:val="18"/>
+                <w:sz w:val="22"/>
               </w:rPr>
               <w:t>6</w:t>
             </w:r>
@@ -930,20 +1436,23 @@
         </w:tc>
         <w:tc>
           <w:tcPr>
-            <w:tcW w:type="dxa" w:w="5386"/>
+            <w:tcW w:type="dxa" w:w="4616"/>
+            <w:gridSpan w:val="2"/>
+            <w:vAlign w:val="top"/>
           </w:tcPr>
           <w:p>
             <w:pPr>
+              <w:spacing w:before="0" w:after="0" w:line="240" w:lineRule="auto"/>
               <w:jc w:val="left"/>
             </w:pPr>
             <w:r/>
             <w:r>
               <w:rPr>
-                <w:rFonts w:ascii="Times New Roman" w:hAnsi="Times New Roman"/>
+                <w:rFonts w:ascii="Times New Roman" w:hAnsi="Times New Roman" w:eastAsia="Times New Roman"/>
                 <w:b/>
                 <w:i w:val="0"/>
                 <w:color w:val="000000"/>
-                <w:sz w:val="18"/>
+                <w:sz w:val="22"/>
               </w:rPr>
               <w:t>Retenue Amicale / Social Deduction</w:t>
             </w:r>
@@ -951,40 +1460,88 @@
         </w:tc>
         <w:tc>
           <w:tcPr>
-            <w:tcW w:type="dxa" w:w="2041"/>
+            <w:tcW w:type="dxa" w:w="1044"/>
+            <w:vAlign w:val="top"/>
           </w:tcPr>
           <w:p>
             <w:pPr>
+              <w:spacing w:before="0" w:after="0" w:line="240" w:lineRule="auto"/>
               <w:jc w:val="center"/>
             </w:pPr>
             <w:r/>
             <w:r>
               <w:rPr>
-                <w:rFonts w:ascii="Times New Roman" w:hAnsi="Times New Roman"/>
-                <w:b w:val="0"/>
+                <w:rFonts w:ascii="Times New Roman" w:hAnsi="Times New Roman" w:eastAsia="Times New Roman"/>
+                <w:b/>
                 <w:i w:val="0"/>
                 <w:color w:val="000000"/>
-                <w:sz w:val="18"/>
+                <w:sz w:val="22"/>
               </w:rPr>
             </w:r>
           </w:p>
         </w:tc>
         <w:tc>
           <w:tcPr>
-            <w:tcW w:type="dxa" w:w="2041"/>
+            <w:tcW w:type="dxa" w:w="1042"/>
+            <w:vAlign w:val="top"/>
           </w:tcPr>
           <w:p>
             <w:pPr>
+              <w:spacing w:before="0" w:after="0" w:line="240" w:lineRule="auto"/>
               <w:jc w:val="center"/>
             </w:pPr>
             <w:r/>
             <w:r>
               <w:rPr>
-                <w:rFonts w:ascii="Times New Roman" w:hAnsi="Times New Roman"/>
-                <w:b w:val="0"/>
+                <w:rFonts w:ascii="Times New Roman" w:hAnsi="Times New Roman" w:eastAsia="Times New Roman"/>
+                <w:b/>
                 <w:i w:val="0"/>
                 <w:color w:val="000000"/>
-                <w:sz w:val="18"/>
+                <w:sz w:val="22"/>
+              </w:rPr>
+            </w:r>
+          </w:p>
+        </w:tc>
+        <w:tc>
+          <w:tcPr>
+            <w:tcW w:type="dxa" w:w="1046"/>
+            <w:vAlign w:val="top"/>
+          </w:tcPr>
+          <w:p>
+            <w:pPr>
+              <w:spacing w:before="0" w:after="0" w:line="240" w:lineRule="auto"/>
+              <w:jc w:val="center"/>
+            </w:pPr>
+            <w:r/>
+            <w:r>
+              <w:rPr>
+                <w:rFonts w:ascii="Times New Roman" w:hAnsi="Times New Roman" w:eastAsia="Times New Roman"/>
+                <w:b/>
+                <w:i w:val="0"/>
+                <w:color w:val="000000"/>
+                <w:sz w:val="22"/>
+              </w:rPr>
+            </w:r>
+          </w:p>
+        </w:tc>
+        <w:tc>
+          <w:tcPr>
+            <w:tcW w:type="dxa" w:w="1876"/>
+            <w:vAlign w:val="top"/>
+          </w:tcPr>
+          <w:p>
+            <w:pPr>
+              <w:spacing w:before="0" w:after="0" w:line="240" w:lineRule="auto"/>
+              <w:jc w:val="center"/>
+            </w:pPr>
+            <w:r/>
+            <w:r>
+              <w:rPr>
+                <w:rFonts w:ascii="Times New Roman" w:hAnsi="Times New Roman" w:eastAsia="Times New Roman"/>
+                <w:b/>
+                <w:i w:val="0"/>
+                <w:color w:val="000000"/>
+                <w:sz w:val="22"/>
               </w:rPr>
               <w:t>{{RETENUE_AMICALE}}</w:t>
             </w:r>
@@ -992,22 +1549,27 @@
         </w:tc>
       </w:tr>
       <w:tr>
+        <w:trPr>
+          <w:trHeight w:val="546" w:hRule="exact"/>
+        </w:trPr>
         <w:tc>
           <w:tcPr>
-            <w:tcW w:type="dxa" w:w="737"/>
+            <w:tcW w:type="dxa" w:w="942"/>
+            <w:vAlign w:val="top"/>
           </w:tcPr>
           <w:p>
             <w:pPr>
+              <w:spacing w:before="0" w:after="0" w:line="240" w:lineRule="auto"/>
               <w:jc w:val="center"/>
             </w:pPr>
             <w:r/>
             <w:r>
               <w:rPr>
-                <w:rFonts w:ascii="Times New Roman" w:hAnsi="Times New Roman"/>
-                <w:b w:val="0"/>
+                <w:rFonts w:ascii="Times New Roman" w:hAnsi="Times New Roman" w:eastAsia="Times New Roman"/>
+                <w:b/>
                 <w:i w:val="0"/>
                 <w:color w:val="000000"/>
-                <w:sz w:val="18"/>
+                <w:sz w:val="22"/>
               </w:rPr>
               <w:t>7</w:t>
             </w:r>
@@ -1015,20 +1577,23 @@
         </w:tc>
         <w:tc>
           <w:tcPr>
-            <w:tcW w:type="dxa" w:w="5386"/>
+            <w:tcW w:type="dxa" w:w="4616"/>
+            <w:gridSpan w:val="2"/>
+            <w:vAlign w:val="top"/>
           </w:tcPr>
           <w:p>
             <w:pPr>
+              <w:spacing w:before="0" w:after="0" w:line="240" w:lineRule="auto"/>
               <w:jc w:val="left"/>
             </w:pPr>
             <w:r/>
             <w:r>
               <w:rPr>
-                <w:rFonts w:ascii="Times New Roman" w:hAnsi="Times New Roman"/>
+                <w:rFonts w:ascii="Times New Roman" w:hAnsi="Times New Roman" w:eastAsia="Times New Roman"/>
                 <w:b/>
                 <w:i w:val="0"/>
                 <w:color w:val="000000"/>
-                <w:sz w:val="18"/>
+                <w:sz w:val="22"/>
               </w:rPr>
               <w:t>Dette / Debt</w:t>
             </w:r>
@@ -1036,40 +1601,88 @@
         </w:tc>
         <w:tc>
           <w:tcPr>
-            <w:tcW w:type="dxa" w:w="2041"/>
+            <w:tcW w:type="dxa" w:w="1044"/>
+            <w:vAlign w:val="top"/>
           </w:tcPr>
           <w:p>
             <w:pPr>
+              <w:spacing w:before="0" w:after="0" w:line="240" w:lineRule="auto"/>
               <w:jc w:val="center"/>
             </w:pPr>
             <w:r/>
             <w:r>
               <w:rPr>
-                <w:rFonts w:ascii="Times New Roman" w:hAnsi="Times New Roman"/>
-                <w:b w:val="0"/>
+                <w:rFonts w:ascii="Times New Roman" w:hAnsi="Times New Roman" w:eastAsia="Times New Roman"/>
+                <w:b/>
                 <w:i w:val="0"/>
                 <w:color w:val="000000"/>
-                <w:sz w:val="18"/>
+                <w:sz w:val="22"/>
               </w:rPr>
             </w:r>
           </w:p>
         </w:tc>
         <w:tc>
           <w:tcPr>
-            <w:tcW w:type="dxa" w:w="2041"/>
+            <w:tcW w:type="dxa" w:w="1042"/>
+            <w:vAlign w:val="top"/>
           </w:tcPr>
           <w:p>
             <w:pPr>
+              <w:spacing w:before="0" w:after="0" w:line="240" w:lineRule="auto"/>
               <w:jc w:val="center"/>
             </w:pPr>
             <w:r/>
             <w:r>
               <w:rPr>
-                <w:rFonts w:ascii="Times New Roman" w:hAnsi="Times New Roman"/>
-                <w:b w:val="0"/>
+                <w:rFonts w:ascii="Times New Roman" w:hAnsi="Times New Roman" w:eastAsia="Times New Roman"/>
+                <w:b/>
                 <w:i w:val="0"/>
                 <w:color w:val="000000"/>
-                <w:sz w:val="18"/>
+                <w:sz w:val="22"/>
+              </w:rPr>
+            </w:r>
+          </w:p>
+        </w:tc>
+        <w:tc>
+          <w:tcPr>
+            <w:tcW w:type="dxa" w:w="1046"/>
+            <w:vAlign w:val="top"/>
+          </w:tcPr>
+          <w:p>
+            <w:pPr>
+              <w:spacing w:before="0" w:after="0" w:line="240" w:lineRule="auto"/>
+              <w:jc w:val="center"/>
+            </w:pPr>
+            <w:r/>
+            <w:r>
+              <w:rPr>
+                <w:rFonts w:ascii="Times New Roman" w:hAnsi="Times New Roman" w:eastAsia="Times New Roman"/>
+                <w:b/>
+                <w:i w:val="0"/>
+                <w:color w:val="000000"/>
+                <w:sz w:val="22"/>
+              </w:rPr>
+            </w:r>
+          </w:p>
+        </w:tc>
+        <w:tc>
+          <w:tcPr>
+            <w:tcW w:type="dxa" w:w="1876"/>
+            <w:vAlign w:val="top"/>
+          </w:tcPr>
+          <w:p>
+            <w:pPr>
+              <w:spacing w:before="0" w:after="0" w:line="240" w:lineRule="auto"/>
+              <w:jc w:val="center"/>
+            </w:pPr>
+            <w:r/>
+            <w:r>
+              <w:rPr>
+                <w:rFonts w:ascii="Times New Roman" w:hAnsi="Times New Roman" w:eastAsia="Times New Roman"/>
+                <w:b/>
+                <w:i w:val="0"/>
+                <w:color w:val="000000"/>
+                <w:sz w:val="22"/>
               </w:rPr>
               <w:t>{{DETTE}}</w:t>
             </w:r>
@@ -1077,24 +1690,33 @@
         </w:tc>
       </w:tr>
       <w:tr>
+        <w:trPr>
+          <w:trHeight w:val="288" w:hRule="exact"/>
+        </w:trPr>
         <w:tc>
           <w:tcPr>
-            <w:tcW w:type="dxa" w:w="6123"/>
+            <w:tcW w:type="dxa" w:w="1840"/>
             <w:gridSpan w:val="2"/>
-            <w:shd w:val="clear" w:color="auto" w:fill="1F7A3D"/>
+            <w:vAlign w:val="center"/>
+            <w:shd w:val="clear" w:color="auto" w:fill="00B050"/>
+            <w:tcBorders>
+              <w:top w:val="single" w:sz="12" w:space="0" w:color="000000"/>
+              <w:bottom w:val="single" w:sz="12" w:space="0" w:color="000000"/>
+            </w:tcBorders>
           </w:tcPr>
           <w:p>
             <w:pPr>
-              <w:jc w:val="left"/>
+              <w:spacing w:before="0" w:after="0" w:line="240" w:lineRule="auto"/>
+              <w:jc w:val="center"/>
             </w:pPr>
             <w:r/>
             <w:r>
               <w:rPr>
-                <w:rFonts w:ascii="Times New Roman" w:hAnsi="Times New Roman"/>
+                <w:rFonts w:ascii="Times New Roman" w:hAnsi="Times New Roman" w:eastAsia="Times New Roman"/>
                 <w:b/>
                 <w:i w:val="0"/>
-                <w:color w:val="FFFFFF"/>
-                <w:sz w:val="18"/>
+                <w:color w:val="000000"/>
+                <w:sz w:val="22"/>
               </w:rPr>
               <w:t>Total</w:t>
             </w:r>
@@ -1102,21 +1724,59 @@
         </w:tc>
         <w:tc>
           <w:tcPr>
-            <w:tcW w:type="dxa" w:w="2041"/>
-            <w:shd w:val="clear" w:color="auto" w:fill="1F7A3D"/>
+            <w:tcW w:type="dxa" w:w="4762"/>
+            <w:gridSpan w:val="2"/>
+            <w:vAlign w:val="center"/>
+            <w:shd w:val="clear" w:color="auto" w:fill="00B050"/>
+            <w:tcBorders>
+              <w:top w:val="single" w:sz="12" w:space="0" w:color="000000"/>
+              <w:bottom w:val="single" w:sz="12" w:space="0" w:color="000000"/>
+              <w:right w:val="single" w:sz="12" w:space="0" w:color="000000"/>
+            </w:tcBorders>
           </w:tcPr>
           <w:p>
             <w:pPr>
+              <w:spacing w:before="0" w:after="0" w:line="240" w:lineRule="auto"/>
               <w:jc w:val="center"/>
             </w:pPr>
             <w:r/>
             <w:r>
               <w:rPr>
-                <w:rFonts w:ascii="Times New Roman" w:hAnsi="Times New Roman"/>
+                <w:rFonts w:ascii="Times New Roman" w:hAnsi="Times New Roman" w:eastAsia="Times New Roman"/>
                 <w:b/>
                 <w:i w:val="0"/>
-                <w:color w:val="FFFFFF"/>
-                <w:sz w:val="18"/>
+                <w:color w:val="000000"/>
+                <w:sz w:val="22"/>
+              </w:rPr>
+            </w:r>
+          </w:p>
+        </w:tc>
+        <w:tc>
+          <w:tcPr>
+            <w:tcW w:type="dxa" w:w="2088"/>
+            <w:gridSpan w:val="2"/>
+            <w:vAlign w:val="center"/>
+            <w:shd w:val="clear" w:color="auto" w:fill="00B050"/>
+            <w:tcBorders>
+              <w:top w:val="single" w:sz="12" w:space="0" w:color="000000"/>
+              <w:bottom w:val="single" w:sz="12" w:space="0" w:color="000000"/>
+              <w:left w:val="single" w:sz="12" w:space="0" w:color="000000"/>
+              <w:right w:val="single" w:sz="12" w:space="0" w:color="000000"/>
+            </w:tcBorders>
+          </w:tcPr>
+          <w:p>
+            <w:pPr>
+              <w:spacing w:before="0" w:after="0" w:line="240" w:lineRule="auto"/>
+              <w:jc w:val="center"/>
+            </w:pPr>
+            <w:r/>
+            <w:r>
+              <w:rPr>
+                <w:rFonts w:ascii="Times New Roman" w:hAnsi="Times New Roman" w:eastAsia="Times New Roman"/>
+                <w:b/>
+                <w:i w:val="0"/>
+                <w:color w:val="000000"/>
+                <w:sz w:val="22"/>
               </w:rPr>
               <w:t>{{TOTAL_GAINS}}</w:t>
             </w:r>
@@ -1124,21 +1784,28 @@
         </w:tc>
         <w:tc>
           <w:tcPr>
-            <w:tcW w:type="dxa" w:w="2041"/>
-            <w:shd w:val="clear" w:color="auto" w:fill="1F7A3D"/>
+            <w:tcW w:type="dxa" w:w="1876"/>
+            <w:vAlign w:val="center"/>
+            <w:shd w:val="clear" w:color="auto" w:fill="00B050"/>
+            <w:tcBorders>
+              <w:top w:val="single" w:sz="12" w:space="0" w:color="000000"/>
+              <w:bottom w:val="single" w:sz="12" w:space="0" w:color="000000"/>
+              <w:left w:val="single" w:sz="12" w:space="0" w:color="000000"/>
+            </w:tcBorders>
           </w:tcPr>
           <w:p>
             <w:pPr>
+              <w:spacing w:before="0" w:after="0" w:line="240" w:lineRule="auto"/>
               <w:jc w:val="center"/>
             </w:pPr>
             <w:r/>
             <w:r>
               <w:rPr>
-                <w:rFonts w:ascii="Times New Roman" w:hAnsi="Times New Roman"/>
+                <w:rFonts w:ascii="Times New Roman" w:hAnsi="Times New Roman" w:eastAsia="Times New Roman"/>
                 <w:b/>
                 <w:i w:val="0"/>
-                <w:color w:val="FFFFFF"/>
-                <w:sz w:val="18"/>
+                <w:color w:val="000000"/>
+                <w:sz w:val="22"/>
               </w:rPr>
               <w:t>{{TOTAL_RETENUES}}</w:t>
             </w:r>
@@ -1146,24 +1813,34 @@
         </w:tc>
       </w:tr>
       <w:tr>
+        <w:trPr>
+          <w:trHeight w:val="288" w:hRule="exact"/>
+        </w:trPr>
         <w:tc>
           <w:tcPr>
-            <w:tcW w:type="dxa" w:w="6123"/>
+            <w:tcW w:type="dxa" w:w="1840"/>
             <w:gridSpan w:val="2"/>
-            <w:shd w:val="clear" w:color="auto" w:fill="1F7A3D"/>
+            <w:vAlign w:val="center"/>
+            <w:shd w:val="clear" w:color="auto" w:fill="00B050"/>
+            <w:tcBorders>
+              <w:top w:val="single" w:sz="12" w:space="0" w:color="000000"/>
+              <w:bottom w:val="single" w:sz="12" w:space="0" w:color="000000"/>
+              <w:right w:val="single" w:sz="12" w:space="0" w:color="000000"/>
+            </w:tcBorders>
           </w:tcPr>
           <w:p>
             <w:pPr>
-              <w:jc w:val="left"/>
+              <w:spacing w:before="0" w:after="0" w:line="240" w:lineRule="auto"/>
+              <w:jc w:val="center"/>
             </w:pPr>
             <w:r/>
             <w:r>
               <w:rPr>
-                <w:rFonts w:ascii="Times New Roman" w:hAnsi="Times New Roman"/>
+                <w:rFonts w:ascii="Times New Roman" w:hAnsi="Times New Roman" w:eastAsia="Times New Roman"/>
                 <w:b/>
                 <w:i w:val="0"/>
-                <w:color w:val="FFFFFF"/>
-                <w:sz w:val="20"/>
+                <w:color w:val="000000"/>
+                <w:sz w:val="22"/>
               </w:rPr>
               <w:t>NET A PAYER</w:t>
             </w:r>
@@ -1171,21 +1848,30 @@
         </w:tc>
         <w:tc>
           <w:tcPr>
-            <w:tcW w:type="dxa" w:w="2041"/>
-            <w:shd w:val="clear" w:color="auto" w:fill="1F7A3D"/>
+            <w:tcW w:type="dxa" w:w="5804"/>
+            <w:gridSpan w:val="3"/>
+            <w:vAlign w:val="center"/>
+            <w:shd w:val="clear" w:color="auto" w:fill="00B050"/>
+            <w:tcBorders>
+              <w:top w:val="single" w:sz="12" w:space="0" w:color="000000"/>
+              <w:bottom w:val="single" w:sz="12" w:space="0" w:color="000000"/>
+              <w:left w:val="single" w:sz="12" w:space="0" w:color="000000"/>
+              <w:right w:val="single" w:sz="12" w:space="0" w:color="000000"/>
+            </w:tcBorders>
           </w:tcPr>
           <w:p>
             <w:pPr>
-              <w:jc w:val="left"/>
+              <w:spacing w:before="0" w:after="0" w:line="240" w:lineRule="auto"/>
+              <w:jc w:val="center"/>
             </w:pPr>
             <w:r/>
             <w:r>
               <w:rPr>
-                <w:rFonts w:ascii="Times New Roman" w:hAnsi="Times New Roman"/>
+                <w:rFonts w:ascii="Times New Roman" w:hAnsi="Times New Roman" w:eastAsia="Times New Roman"/>
                 <w:b/>
                 <w:i w:val="0"/>
-                <w:color w:val="FFFFFF"/>
-                <w:sz w:val="18"/>
+                <w:color w:val="000000"/>
+                <w:sz w:val="20"/>
               </w:rPr>
               <w:t>{{NET_EN_LETTRES}}</w:t>
             </w:r>
@@ -1193,82 +1879,190 @@
         </w:tc>
         <w:tc>
           <w:tcPr>
-            <w:tcW w:type="dxa" w:w="2041"/>
-            <w:shd w:val="clear" w:color="auto" w:fill="1F7A3D"/>
+            <w:tcW w:type="dxa" w:w="2922"/>
+            <w:gridSpan w:val="2"/>
+            <w:vAlign w:val="center"/>
+            <w:shd w:val="clear" w:color="auto" w:fill="00B050"/>
+            <w:tcBorders>
+              <w:top w:val="single" w:sz="12" w:space="0" w:color="000000"/>
+              <w:bottom w:val="single" w:sz="12" w:space="0" w:color="000000"/>
+              <w:left w:val="single" w:sz="12" w:space="0" w:color="000000"/>
+            </w:tcBorders>
           </w:tcPr>
           <w:p>
             <w:pPr>
+              <w:spacing w:before="0" w:after="0" w:line="240" w:lineRule="auto"/>
               <w:jc w:val="center"/>
             </w:pPr>
             <w:r/>
             <w:r>
               <w:rPr>
-                <w:rFonts w:ascii="Times New Roman" w:hAnsi="Times New Roman"/>
+                <w:rFonts w:ascii="Times New Roman" w:hAnsi="Times New Roman" w:eastAsia="Times New Roman"/>
                 <w:b/>
                 <w:i w:val="0"/>
-                <w:color w:val="FFFFFF"/>
-                <w:sz w:val="20"/>
+                <w:color w:val="000000"/>
+                <w:sz w:val="22"/>
               </w:rPr>
               <w:t>{{NET_A_PERÇEVOIR}}</w:t>
             </w:r>
           </w:p>
         </w:tc>
       </w:tr>
+      <w:tr>
+        <w:trPr>
+          <w:trHeight w:val="280" w:hRule="exact"/>
+        </w:trPr>
+        <w:tc>
+          <w:tcPr>
+            <w:tcW w:type="dxa" w:w="942"/>
+            <w:vAlign w:val="center"/>
+            <w:tcBorders>
+              <w:top w:val="single" w:sz="12" w:space="0" w:color="000000"/>
+            </w:tcBorders>
+          </w:tcPr>
+          <w:p>
+            <w:pPr>
+              <w:spacing w:before="0" w:after="0" w:line="240" w:lineRule="auto"/>
+              <w:jc w:val="center"/>
+            </w:pPr>
+            <w:r/>
+            <w:r>
+              <w:rPr>
+                <w:rFonts w:ascii="Times New Roman" w:hAnsi="Times New Roman" w:eastAsia="Times New Roman"/>
+                <w:b/>
+                <w:i w:val="0"/>
+                <w:color w:val="000000"/>
+                <w:sz w:val="22"/>
+              </w:rPr>
+            </w:r>
+          </w:p>
+        </w:tc>
+        <w:tc>
+          <w:tcPr>
+            <w:tcW w:type="dxa" w:w="9624"/>
+            <w:gridSpan w:val="6"/>
+            <w:vAlign w:val="top"/>
+            <w:tcBorders>
+              <w:top w:val="single" w:sz="12" w:space="0" w:color="000000"/>
+            </w:tcBorders>
+          </w:tcPr>
+          <w:p>
+            <w:pPr>
+              <w:spacing w:before="0" w:after="0" w:line="240" w:lineRule="auto"/>
+              <w:jc w:val="center"/>
+            </w:pPr>
+            <w:r/>
+            <w:r>
+              <w:rPr>
+                <w:rFonts w:ascii="Times New Roman" w:hAnsi="Times New Roman" w:eastAsia="Times New Roman"/>
+                <w:b/>
+                <w:i w:val="0"/>
+                <w:color w:val="000000"/>
+                <w:sz w:val="22"/>
+              </w:rPr>
+              <w:t>Done at Yaoundé on the / Fait à Yaoundé le:</w:t>
+            </w:r>
+          </w:p>
+        </w:tc>
+      </w:tr>
+      <w:tr>
+        <w:trPr>
+          <w:trHeight w:val="1096" w:hRule="exact"/>
+        </w:trPr>
+        <w:tc>
+          <w:tcPr>
+            <w:tcW w:type="dxa" w:w="10566"/>
+            <w:gridSpan w:val="7"/>
+            <w:vAlign w:val="center"/>
+          </w:tcPr>
+          <w:p>
+            <w:pPr>
+              <w:spacing w:before="0" w:after="0" w:line="240" w:lineRule="auto"/>
+              <w:jc w:val="center"/>
+            </w:pPr>
+            <w:r/>
+            <w:r>
+              <w:rPr>
+                <w:rFonts w:ascii="Times New Roman" w:hAnsi="Times New Roman" w:eastAsia="Times New Roman"/>
+                <w:b/>
+                <w:i w:val="0"/>
+                <w:color w:val="000000"/>
+                <w:sz w:val="22"/>
+              </w:rPr>
+            </w:r>
+          </w:p>
+        </w:tc>
+      </w:tr>
+      <w:tr>
+        <w:trPr>
+          <w:trHeight w:val="276" w:hRule="exact"/>
+        </w:trPr>
+        <w:tc>
+          <w:tcPr>
+            <w:tcW w:type="dxa" w:w="10566"/>
+            <w:gridSpan w:val="7"/>
+            <w:vAlign w:val="center"/>
+          </w:tcPr>
+          <w:p>
+            <w:pPr>
+              <w:spacing w:before="0" w:after="0" w:line="240" w:lineRule="auto"/>
+              <w:ind w:right="680"/>
+              <w:jc w:val="right"/>
+            </w:pPr>
+            <w:r/>
+            <w:r>
+              <w:rPr>
+                <w:rFonts w:ascii="Arial" w:hAnsi="Arial" w:eastAsia="Arial"/>
+                <w:b/>
+                <w:i w:val="0"/>
+                <w:color w:val="000000"/>
+                <w:sz w:val="22"/>
+              </w:rPr>
+              <w:t>Le Coordonateur Général/The General Coordinator</w:t>
+            </w:r>
+          </w:p>
+        </w:tc>
+      </w:tr>
+      <w:tr>
+        <w:trPr>
+          <w:trHeight w:val="290" w:hRule="exact"/>
+        </w:trPr>
+        <w:tc>
+          <w:tcPr>
+            <w:tcW w:type="dxa" w:w="10566"/>
+            <w:gridSpan w:val="7"/>
+            <w:vAlign w:val="center"/>
+          </w:tcPr>
+          <w:p>
+            <w:pPr>
+              <w:spacing w:before="0" w:after="0" w:line="240" w:lineRule="auto"/>
+              <w:jc w:val="center"/>
+            </w:pPr>
+            <w:r/>
+            <w:r>
+              <w:rPr>
+                <w:rFonts w:ascii="Times New Roman" w:hAnsi="Times New Roman" w:eastAsia="Times New Roman"/>
+                <w:b/>
+                <w:i w:val="0"/>
+                <w:color w:val="000000"/>
+                <w:sz w:val="22"/>
+              </w:rPr>
+            </w:r>
+          </w:p>
+        </w:tc>
+      </w:tr>
     </w:tbl>
-    <w:p/>
     <w:p>
       <w:pPr>
+        <w:spacing w:before="0" w:after="0" w:line="20" w:lineRule="exact"/>
         <w:jc w:val="center"/>
       </w:pPr>
-      <w:r>
-        <w:rPr>
-          <w:rFonts w:ascii="Times New Roman" w:hAnsi="Times New Roman"/>
-          <w:b/>
-          <w:sz w:val="20"/>
-        </w:rPr>
-        <w:t>Done at Yaoundé on the / Fait à Yaoundé le: {{DATE_GENERATION}}</w:t>
-      </w:r>
-    </w:p>
-    <w:p/>
-    <w:p/>
-    <w:p/>
-    <w:p>
-      <w:pPr>
-        <w:jc w:val="center"/>
-      </w:pPr>
-      <w:r>
-        <w:rPr>
-          <w:rFonts w:ascii="Times New Roman" w:hAnsi="Times New Roman"/>
-          <w:b/>
-          <w:sz w:val="20"/>
-        </w:rPr>
-        <w:t>Le Coordonateur Général/</w:t>
-      </w:r>
-    </w:p>
-    <w:p>
-      <w:pPr>
-        <w:jc w:val="center"/>
-      </w:pPr>
-      <w:r>
-        <w:rPr>
-          <w:rFonts w:ascii="Times New Roman" w:hAnsi="Times New Roman"/>
-          <w:b/>
-          <w:sz w:val="20"/>
-        </w:rPr>
-        <w:t>The General Coordinator</w:t>
-      </w:r>
     </w:p>
     <w:sectPr>
       <w:pgSz w:w="11906" w:h="16838"/>
-      <w:pgMar w:top="680" w:right="850" w:bottom="680" w:left="850" w:header="720" w:footer="720" w:gutter="0"/>
+      <w:pgMar w:top="1794" w:right="670" w:bottom="567" w:left="670" w:header="720" w:footer="720" w:gutter="0"/>
       <w:cols w:space="720"/>
       <w:docGrid w:linePitch="360"/>
-      <w:pgBorders w:offsetFrom="page">
-        <w:top w:val="single" w:sz="12" w:space="24" w:color="000000"/>
-        <w:left w:val="single" w:sz="12" w:space="24" w:color="000000"/>
-        <w:bottom w:val="single" w:sz="12" w:space="24" w:color="000000"/>
-        <w:right w:val="single" w:sz="12" w:space="24" w:color="000000"/>
-      </w:pgBorders>
     </w:sectPr>
   </w:body>
 </w:document>
@@ -1637,9 +2431,12 @@
     <w:name w:val="Normal"/>
     <w:qFormat/>
     <w:rsid w:val="00FC693F"/>
+    <w:pPr>
+      <w:spacing w:after="0" w:before="0"/>
+    </w:pPr>
     <w:rPr>
       <w:rFonts w:ascii="Times New Roman" w:hAnsi="Times New Roman"/>
-      <w:sz w:val="20"/>
+      <w:sz w:val="22"/>
     </w:rPr>
   </w:style>
   <w:style w:type="paragraph" w:styleId="Header">

</xml_diff>